<commit_message>
Revision 1 all figures
</commit_message>
<xml_diff>
--- a/Manuscript/Prog_in_Neurobiology_Revision/2_COMMENTS_PROG_NEUROBIOL.docx
+++ b/Manuscript/Prog_in_Neurobiology_Revision/2_COMMENTS_PROG_NEUROBIOL.docx
@@ -48,6 +48,9 @@
       </w:r>
       <w:r>
         <w:br/>
+      </w:r>
+      <w:r>
+        <w:lastRenderedPageBreak/>
         <w:t>2. The explanation (in words) of Model 2 was even more simple and straightforward in the methods, whereas it was a little hard to follow in the results. Would recommend clarifying/rephrasing in the results.</w:t>
       </w:r>
       <w:r>
@@ -88,142 +91,54 @@
       <w:pPr>
         <w:spacing w:after="160"/>
         <w:rPr>
-          <w:del w:id="0" w:author="Rossella" w:date="2026-07-30T18:28:00Z" w16du:dateUtc="2026-07-30T22:28:00Z"/>
           <w:b/>
           <w:bCs/>
           <w:color w:val="0070C0"/>
         </w:rPr>
       </w:pPr>
-      <w:del w:id="1" w:author="Rossella" w:date="2026-07-30T18:28:00Z" w16du:dateUtc="2026-07-30T22:28:00Z">
-        <w:r>
-          <w:rPr>
-            <w:b/>
-            <w:bCs/>
-            <w:color w:val="0070C0"/>
-          </w:rPr>
-          <w:delText>Siyu Analysis: inverse coding at GO cue</w:delText>
-        </w:r>
-      </w:del>
+      <w:r>
+        <w:rPr>
+          <w:b/>
+          <w:bCs/>
+          <w:color w:val="0070C0"/>
+        </w:rPr>
+        <w:t xml:space="preserve">We thank the reviewer for this suggestion. </w:t>
+      </w:r>
     </w:p>
     <w:p>
       <w:pPr>
         <w:spacing w:after="160"/>
         <w:rPr>
-          <w:del w:id="2" w:author="Rossella" w:date="2026-07-30T18:28:00Z" w16du:dateUtc="2026-07-30T22:28:00Z"/>
-          <w:color w:val="EE0000"/>
-        </w:rPr>
-      </w:pPr>
-      <w:del w:id="3" w:author="Rossella" w:date="2026-07-30T18:28:00Z" w16du:dateUtc="2026-07-30T22:28:00Z">
-        <w:r>
-          <w:rPr>
-            <w:color w:val="EE0000"/>
-          </w:rPr>
-          <w:delText>We thank the</w:delText>
-        </w:r>
-      </w:del>
-      <w:ins w:id="4" w:author="Rossella" w:date="2026-07-30T18:28:00Z" w16du:dateUtc="2026-07-30T22:28:00Z">
-        <w:r>
-          <w:rPr>
-            <w:b/>
-            <w:bCs/>
-            <w:color w:val="0070C0"/>
-          </w:rPr>
-          <w:t>The</w:t>
-        </w:r>
-      </w:ins>
-      <w:r>
-        <w:rPr>
           <w:b/>
-          <w:color w:val="0070C0"/>
-          <w:rPrChange w:id="5" w:author="Rossella" w:date="2026-07-30T18:28:00Z" w16du:dateUtc="2026-07-30T22:28:00Z">
-            <w:rPr>
-              <w:color w:val="EE0000"/>
-            </w:rPr>
-          </w:rPrChange>
-        </w:rPr>
-        <w:t xml:space="preserve"> reviewer </w:t>
-      </w:r>
-      <w:ins w:id="6" w:author="Rossella" w:date="2026-07-30T18:28:00Z" w16du:dateUtc="2026-07-30T22:28:00Z">
-        <w:r>
-          <w:rPr>
-            <w:b/>
-            <w:bCs/>
-            <w:color w:val="0070C0"/>
-          </w:rPr>
-          <w:t xml:space="preserve">is asking </w:t>
-        </w:r>
-      </w:ins>
+          <w:bCs/>
+          <w:color w:val="0070C0"/>
+        </w:rPr>
+      </w:pPr>
       <w:r>
         <w:rPr>
           <w:b/>
-          <w:color w:val="0070C0"/>
-          <w:rPrChange w:id="7" w:author="Rossella" w:date="2026-07-30T18:28:00Z" w16du:dateUtc="2026-07-30T22:28:00Z">
-            <w:rPr>
-              <w:color w:val="EE0000"/>
-            </w:rPr>
-          </w:rPrChange>
-        </w:rPr>
-        <w:t xml:space="preserve">for </w:t>
-      </w:r>
-      <w:del w:id="8" w:author="Rossella" w:date="2026-07-30T18:28:00Z" w16du:dateUtc="2026-07-30T22:28:00Z">
-        <w:r>
-          <w:rPr>
-            <w:color w:val="EE0000"/>
-          </w:rPr>
-          <w:delText>this point.   We have extended</w:delText>
-        </w:r>
-      </w:del>
-      <w:ins w:id="9" w:author="Rossella" w:date="2026-07-30T18:28:00Z" w16du:dateUtc="2026-07-30T22:28:00Z">
-        <w:r>
-          <w:rPr>
-            <w:b/>
-            <w:bCs/>
-            <w:color w:val="0070C0"/>
-          </w:rPr>
-          <w:t>the inversion of</w:t>
-        </w:r>
-      </w:ins>
-      <w:r>
+          <w:bCs/>
+          <w:color w:val="0070C0"/>
+        </w:rPr>
+        <w:t xml:space="preserve">We have repeated the analysis of the inversion coding both before and after 250 milliseconds from the onset of the go signal. We found that, in both monkeys, the inverse coding persisted beyond the first 250 ms of the go signal. </w:t>
+      </w:r>
+    </w:p>
+    <w:p>
+      <w:pPr>
+        <w:spacing w:after="160"/>
         <w:rPr>
           <w:b/>
-          <w:color w:val="0070C0"/>
-          <w:rPrChange w:id="10" w:author="Rossella" w:date="2026-07-30T18:28:00Z" w16du:dateUtc="2026-07-30T22:28:00Z">
-            <w:rPr>
-              <w:color w:val="EE0000"/>
-            </w:rPr>
-          </w:rPrChange>
-        </w:rPr>
-        <w:t xml:space="preserve"> the </w:t>
-      </w:r>
-      <w:del w:id="11" w:author="Rossella" w:date="2026-07-30T18:28:00Z" w16du:dateUtc="2026-07-30T22:28:00Z">
-        <w:r>
-          <w:rPr>
-            <w:color w:val="EE0000"/>
-          </w:rPr>
-          <w:delText xml:space="preserve">same analysis in the first ?? ms after </w:delText>
-        </w:r>
-      </w:del>
-      <w:ins w:id="12" w:author="Rossella" w:date="2026-07-30T18:28:00Z" w16du:dateUtc="2026-07-30T22:28:00Z">
-        <w:r>
-          <w:rPr>
-            <w:b/>
-            <w:bCs/>
-            <w:color w:val="0070C0"/>
-          </w:rPr>
-          <w:t xml:space="preserve">coding at </w:t>
-        </w:r>
-      </w:ins>
+          <w:bCs/>
+          <w:color w:val="0070C0"/>
+        </w:rPr>
+      </w:pPr>
       <w:r>
         <w:rPr>
           <w:b/>
-          <w:color w:val="0070C0"/>
-          <w:rPrChange w:id="13" w:author="Rossella" w:date="2026-07-30T18:28:00Z" w16du:dateUtc="2026-07-30T22:28:00Z">
-            <w:rPr>
-              <w:color w:val="EE0000"/>
-            </w:rPr>
-          </w:rPrChange>
-        </w:rPr>
-        <w:t xml:space="preserve">the go signal. </w:t>
+          <w:bCs/>
+          <w:color w:val="0070C0"/>
+        </w:rPr>
+        <w:t xml:space="preserve">This is because both monkeys continue to have a representation of the offer value even after the go signal. This is not surprising, given that the cue is always visible to the animal throughout the trial. </w:t>
       </w:r>
     </w:p>
     <w:p>
@@ -231,73 +146,49 @@
         <w:spacing w:after="160"/>
         <w:rPr>
           <w:b/>
-          <w:color w:val="0070C0"/>
-          <w:rPrChange w:id="14" w:author="Rossella" w:date="2026-07-30T18:28:00Z" w16du:dateUtc="2026-07-30T22:28:00Z">
-            <w:rPr>
-              <w:color w:val="EE0000"/>
-            </w:rPr>
-          </w:rPrChange>
-        </w:rPr>
-      </w:pPr>
-      <w:del w:id="15" w:author="Rossella" w:date="2026-07-30T18:28:00Z" w16du:dateUtc="2026-07-30T22:28:00Z">
-        <w:r>
-          <w:rPr>
-            <w:color w:val="EE0000"/>
-          </w:rPr>
-          <w:delText>We can show the plots only to</w:delText>
-        </w:r>
-      </w:del>
-      <w:ins w:id="16" w:author="Rossella" w:date="2026-07-30T18:28:00Z" w16du:dateUtc="2026-07-30T22:28:00Z">
-        <w:r>
-          <w:rPr>
-            <w:b/>
-            <w:bCs/>
-            <w:color w:val="0070C0"/>
-          </w:rPr>
-          <w:t>Or we do as</w:t>
-        </w:r>
-      </w:ins>
+          <w:bCs/>
+          <w:color w:val="0070C0"/>
+        </w:rPr>
+      </w:pPr>
       <w:r>
         <w:rPr>
           <w:b/>
-          <w:color w:val="0070C0"/>
-          <w:rPrChange w:id="17" w:author="Rossella" w:date="2026-07-30T18:28:00Z" w16du:dateUtc="2026-07-30T22:28:00Z">
-            <w:rPr>
-              <w:color w:val="EE0000"/>
-            </w:rPr>
-          </w:rPrChange>
-        </w:rPr>
-        <w:t xml:space="preserve"> the reviewer</w:t>
-      </w:r>
-      <w:del w:id="18" w:author="Rossella" w:date="2026-07-30T18:28:00Z" w16du:dateUtc="2026-07-30T22:28:00Z">
-        <w:r>
-          <w:rPr>
-            <w:color w:val="EE0000"/>
-          </w:rPr>
-          <w:delText>. But not in the manuscript</w:delText>
-        </w:r>
-      </w:del>
-      <w:ins w:id="19" w:author="Rossella" w:date="2026-07-30T18:28:00Z" w16du:dateUtc="2026-07-30T22:28:00Z">
-        <w:r>
-          <w:rPr>
-            <w:b/>
-            <w:bCs/>
-            <w:color w:val="0070C0"/>
-          </w:rPr>
-          <w:t xml:space="preserve"> asks or eventually we reply as per reviewer 2 comment</w:t>
-        </w:r>
-      </w:ins>
+          <w:bCs/>
+          <w:color w:val="0070C0"/>
+        </w:rPr>
+        <w:t>The difference between the animals lies in how the go signal, if at all, is incorporated into the value space. We have provided some evidence for this by responding to a</w:t>
+      </w:r>
       <w:r>
         <w:rPr>
           <w:b/>
-          <w:color w:val="0070C0"/>
-          <w:rPrChange w:id="20" w:author="Rossella" w:date="2026-07-30T18:28:00Z" w16du:dateUtc="2026-07-30T22:28:00Z">
-            <w:rPr>
-              <w:color w:val="EE0000"/>
-            </w:rPr>
-          </w:rPrChange>
-        </w:rPr>
-        <w:t xml:space="preserve">. </w:t>
+          <w:bCs/>
+          <w:color w:val="0070C0"/>
+        </w:rPr>
+        <w:t xml:space="preserve"> very similar</w:t>
+      </w:r>
+      <w:r>
+        <w:rPr>
+          <w:b/>
+          <w:bCs/>
+          <w:color w:val="0070C0"/>
+        </w:rPr>
+        <w:t xml:space="preserve"> comment raised by the second reviewer</w:t>
+      </w:r>
+      <w:r>
+        <w:rPr>
+          <w:b/>
+          <w:bCs/>
+          <w:color w:val="0070C0"/>
+        </w:rPr>
+        <w:t xml:space="preserve">, </w:t>
+      </w:r>
+      <w:r>
+        <w:rPr>
+          <w:b/>
+          <w:bCs/>
+          <w:color w:val="0070C0"/>
+        </w:rPr>
+        <w:t>below.</w:t>
       </w:r>
     </w:p>
     <w:p>
@@ -320,27 +211,43 @@
       <w:pPr>
         <w:spacing w:after="160"/>
         <w:rPr>
-          <w:ins w:id="21" w:author="Rossella" w:date="2026-07-30T18:28:00Z" w16du:dateUtc="2026-07-30T22:28:00Z"/>
-          <w:color w:val="EE0000"/>
-        </w:rPr>
-      </w:pPr>
-      <w:r>
-        <w:rPr>
-          <w:color w:val="EE0000"/>
-        </w:rPr>
-        <w:t xml:space="preserve">We thank the reviewer for this important point. We agree that differences in recording locations across monkeys could potentially contribute to the difference in the proportion of linearly coding neurons. Although the exact anatomical correspondence between recording sites across animals cannot be established in our dataset, we performed an additional analysis within Monkey S by comparing arrays from different recording locations. In the array that was most comparable to the recording region sampled in Monkey T, we identified only 3 linearly coding neurons out of 44 recorded neurons (~7%), which is substantially lower than the proportion observed in Monkey T. </w:t>
+          <w:b/>
+          <w:bCs/>
+          <w:color w:val="4F81BD" w:themeColor="accent1"/>
+        </w:rPr>
+      </w:pPr>
+      <w:r>
+        <w:rPr>
+          <w:b/>
+          <w:bCs/>
+          <w:color w:val="4F81BD" w:themeColor="accent1"/>
+        </w:rPr>
+        <w:t xml:space="preserve">We thank the reviewer for this important point. We agree that differences in recording locations across monkeys could potentially contribute to the difference in the proportion of linearly coding neurons. Although the exact anatomical correspondence between recording sites across animals cannot be established in our dataset, we performed an additional analysis within Monkey S by comparing arrays from different recording locations. In the array that was most comparable to the recording region sampled in </w:t>
+      </w:r>
+      <w:r>
+        <w:rPr>
+          <w:b/>
+          <w:bCs/>
+          <w:color w:val="4F81BD" w:themeColor="accent1"/>
+        </w:rPr>
+        <w:lastRenderedPageBreak/>
+        <w:t xml:space="preserve">Monkey T, we identified only 3 linearly coding neurons out of 44 recorded neurons (~7%), which is substantially lower than the proportion observed in Monkey T. </w:t>
       </w:r>
     </w:p>
     <w:p>
       <w:pPr>
         <w:spacing w:after="160"/>
         <w:rPr>
-          <w:color w:val="EE0000"/>
-        </w:rPr>
-      </w:pPr>
-      <w:r>
-        <w:rPr>
-          <w:color w:val="EE0000"/>
+          <w:b/>
+          <w:bCs/>
+          <w:color w:val="4F81BD" w:themeColor="accent1"/>
+        </w:rPr>
+      </w:pPr>
+      <w:r>
+        <w:rPr>
+          <w:b/>
+          <w:bCs/>
+          <w:color w:val="4F81BD" w:themeColor="accent1"/>
         </w:rPr>
         <w:t xml:space="preserve">The difference in recording location alone is unlikely to fully explain the difference, although we cannot completely exclude a contribution from anatomical sampling. However, this comparison is based on a small number of linearly coding neurons in Monkey S and should therefore be interpreted cautiously. We have revised the manuscript accordingly: </w:t>
       </w:r>
@@ -354,7 +261,7 @@
           <w:color w:val="EE0000"/>
         </w:rPr>
       </w:pPr>
-      <w:commentRangeStart w:id="22"/>
+      <w:commentRangeStart w:id="0"/>
       <w:r>
         <w:rPr>
           <w:b/>
@@ -363,7 +270,7 @@
         </w:rPr>
         <w:t xml:space="preserve">Please see the lines ??-?? </w:t>
       </w:r>
-      <w:commentRangeEnd w:id="22"/>
+      <w:commentRangeEnd w:id="0"/>
       <w:r>
         <w:rPr>
           <w:rStyle w:val="CommentReference"/>
@@ -373,195 +280,8 @@
           <w:sz w:val="22"/>
           <w:szCs w:val="22"/>
         </w:rPr>
-        <w:commentReference w:id="22"/>
-      </w:r>
-    </w:p>
-    <w:p>
-      <w:pPr>
-        <w:spacing w:after="160"/>
-        <w:rPr>
-          <w:del w:id="23" w:author="Rossella" w:date="2026-07-30T18:28:00Z" w16du:dateUtc="2026-07-30T22:28:00Z"/>
-          <w:b/>
-          <w:bCs/>
-          <w:i/>
-          <w:iCs/>
-          <w:color w:val="FF0000"/>
-        </w:rPr>
-      </w:pPr>
-      <w:del w:id="24" w:author="Rossella" w:date="2026-07-30T18:28:00Z" w16du:dateUtc="2026-07-30T22:28:00Z">
-        <w:r>
-          <w:rPr>
-            <w:rFonts w:ascii="Times New Roman" w:eastAsia="Times New Roman" w:hAnsi="Times New Roman" w:cs="Times New Roman"/>
-            <w:i/>
-            <w:iCs/>
-            <w:color w:val="FF0000"/>
-            <w:sz w:val="24"/>
-            <w:szCs w:val="24"/>
-          </w:rPr>
-          <w:delText>These results suggest that the dlPFC neurons in Monkey S exhibited a lower prevalence in linear value coding and more heterogeneous patterns of value representation, whereas neurons in Monkey T showed a greater proportion  of linear coding of offer value.</w:delText>
-        </w:r>
-        <w:r>
-          <w:rPr>
-            <w:b/>
-            <w:bCs/>
-            <w:i/>
-            <w:iCs/>
-            <w:color w:val="FF0000"/>
-          </w:rPr>
-          <w:delText xml:space="preserve"> </w:delText>
-        </w:r>
-      </w:del>
-    </w:p>
-    <w:p>
-      <w:pPr>
-        <w:spacing w:after="160"/>
-        <w:rPr>
-          <w:del w:id="25" w:author="Rossella" w:date="2026-07-30T18:28:00Z" w16du:dateUtc="2026-07-30T22:28:00Z"/>
-          <w:b/>
-          <w:bCs/>
-          <w:color w:val="FF0000"/>
-        </w:rPr>
-      </w:pPr>
-      <w:del w:id="26" w:author="Rossella" w:date="2026-07-30T18:28:00Z" w16du:dateUtc="2026-07-30T22:28:00Z">
-        <w:r>
-          <w:rPr>
-            <w:b/>
-            <w:bCs/>
-            <w:color w:val="FF0000"/>
-          </w:rPr>
-          <w:delText>We also changed the discussion. Please see lines ??-??:</w:delText>
-        </w:r>
-      </w:del>
-    </w:p>
-    <w:p>
-      <w:pPr>
-        <w:shd w:val="clear" w:color="auto" w:fill="FFFFFF"/>
-        <w:spacing w:line="480" w:lineRule="auto"/>
-        <w:rPr>
-          <w:del w:id="27" w:author="Rossella" w:date="2026-07-30T18:28:00Z" w16du:dateUtc="2026-07-30T22:28:00Z"/>
-          <w:rFonts w:ascii="Times New Roman" w:eastAsia="Times New Roman" w:hAnsi="Times New Roman" w:cs="Times New Roman"/>
-          <w:i/>
-          <w:iCs/>
-          <w:color w:val="FF0000"/>
-          <w:sz w:val="24"/>
-          <w:szCs w:val="24"/>
-        </w:rPr>
-      </w:pPr>
-      <w:del w:id="28" w:author="Rossella" w:date="2026-07-30T18:28:00Z" w16du:dateUtc="2026-07-30T22:28:00Z">
-        <w:r>
-          <w:rPr>
-            <w:rFonts w:ascii="Times New Roman" w:eastAsia="Times New Roman" w:hAnsi="Times New Roman" w:cs="Times New Roman"/>
-            <w:i/>
-            <w:iCs/>
-            <w:color w:val="FF0000"/>
-            <w:sz w:val="24"/>
-            <w:szCs w:val="24"/>
-          </w:rPr>
-          <w:delText xml:space="preserve">Additional single-neuron and population-level analyses </w:delText>
-        </w:r>
-        <w:r>
-          <w:rPr>
-            <w:rFonts w:ascii="Times New Roman" w:eastAsia="Times New Roman" w:hAnsi="Times New Roman" w:cs="Times New Roman"/>
-            <w:i/>
-            <w:iCs/>
-            <w:color w:val="FF0000"/>
-            <w:sz w:val="24"/>
-            <w:szCs w:val="24"/>
-            <w:highlight w:val="yellow"/>
-          </w:rPr>
-          <w:delText>revealed</w:delText>
-        </w:r>
-        <w:r>
-          <w:rPr>
-            <w:rFonts w:ascii="Times New Roman" w:eastAsia="Times New Roman" w:hAnsi="Times New Roman" w:cs="Times New Roman"/>
-            <w:i/>
-            <w:iCs/>
-            <w:color w:val="FF0000"/>
-            <w:sz w:val="24"/>
-            <w:szCs w:val="24"/>
-          </w:rPr>
-          <w:delText xml:space="preserve"> the neural differences between the animals in how dlPFC encoded reward and time. In the first analysis, we examined the linearity of value coding. In Monkey S, only 10% of the neurons </w:delText>
-        </w:r>
-        <w:r>
-          <w:rPr>
-            <w:rFonts w:ascii="Times New Roman" w:eastAsia="Times New Roman" w:hAnsi="Times New Roman" w:cs="Times New Roman"/>
-            <w:i/>
-            <w:iCs/>
-            <w:color w:val="FF0000"/>
-            <w:sz w:val="24"/>
-            <w:szCs w:val="24"/>
-            <w:highlight w:val="yellow"/>
-          </w:rPr>
-          <w:delText>showed linear modulation by discounted value</w:delText>
-        </w:r>
-        <w:r>
-          <w:rPr>
-            <w:rFonts w:ascii="Times New Roman" w:eastAsia="Times New Roman" w:hAnsi="Times New Roman" w:cs="Times New Roman"/>
-            <w:i/>
-            <w:iCs/>
-            <w:color w:val="FF0000"/>
-            <w:sz w:val="24"/>
-            <w:szCs w:val="24"/>
-          </w:rPr>
-          <w:delText xml:space="preserve">; however, the population showed an early inverse correlation between reward magnitude and delay. Population trajectories were qualitatively entangled, suggesting that value integration was distributed across the population and involved complex nonlinear relationships with reward and delay. In contrast, in Monkey T, </w:delText>
-        </w:r>
-        <w:r>
-          <w:rPr>
-            <w:rFonts w:ascii="Times New Roman" w:eastAsia="Times New Roman" w:hAnsi="Times New Roman" w:cs="Times New Roman"/>
-            <w:i/>
-            <w:iCs/>
-            <w:color w:val="FF0000"/>
-            <w:sz w:val="24"/>
-            <w:szCs w:val="24"/>
-            <w:highlight w:val="yellow"/>
-          </w:rPr>
-          <w:delText>a larger proportion of neurons (&gt; 30%) showed linear value coding.</w:delText>
-        </w:r>
-        <w:r>
-          <w:rPr>
-            <w:rFonts w:ascii="Times New Roman" w:eastAsia="Times New Roman" w:hAnsi="Times New Roman" w:cs="Times New Roman"/>
-            <w:i/>
-            <w:iCs/>
-            <w:color w:val="FF0000"/>
-            <w:sz w:val="24"/>
-            <w:szCs w:val="24"/>
-          </w:rPr>
-          <w:delText xml:space="preserve"> Population trajectories were qualitatively unentangled and linear, with low-dimensional population trajectories clearly separated by value.</w:delText>
-        </w:r>
-      </w:del>
-    </w:p>
-    <w:p>
-      <w:pPr>
-        <w:shd w:val="clear" w:color="auto" w:fill="FFFFFF"/>
-        <w:spacing w:line="480" w:lineRule="auto"/>
-        <w:rPr>
-          <w:del w:id="29" w:author="Rossella" w:date="2026-07-30T18:28:00Z" w16du:dateUtc="2026-07-30T22:28:00Z"/>
-          <w:b/>
-          <w:bCs/>
-          <w:color w:val="FF0000"/>
-        </w:rPr>
-      </w:pPr>
-      <w:del w:id="30" w:author="Rossella" w:date="2026-07-30T18:28:00Z" w16du:dateUtc="2026-07-30T22:28:00Z">
-        <w:r>
-          <w:rPr>
-            <w:rFonts w:ascii="Times New Roman" w:eastAsia="Times New Roman" w:hAnsi="Times New Roman" w:cs="Times New Roman"/>
-            <w:i/>
-            <w:iCs/>
-            <w:color w:val="FF0000"/>
-            <w:sz w:val="24"/>
-            <w:szCs w:val="24"/>
-          </w:rPr>
-          <w:delText>Although these differences may reflect distinct patterns of value coding across animals, they could also be influenced by differences in recording locations. To address this possibility, we compared linear coding across different recording arrays within Monkey S. The array most comparable to the recording region sampled in Monkey T contained only 3 linearly coding neurons out of 44 recorded neurons (~7%), which was substantially lower than the proportion observed in Monkey T. Thus, differences in recording location alone are unlikely to fully account for the higher prevalence of linear value coding observed in Monkey T. Nevertheless, this comparison is limited by the lack of precise anatomical correspondence between recording sites across animals and by the small number of linearly coding neurons in Monkey S.</w:delText>
-        </w:r>
-        <w:r>
-          <w:rPr>
-            <w:rFonts w:ascii="Times New Roman" w:eastAsia="Times New Roman" w:hAnsi="Times New Roman" w:cs="Times New Roman"/>
-            <w:sz w:val="24"/>
-            <w:szCs w:val="24"/>
-          </w:rPr>
-          <w:delText xml:space="preserve"> </w:delText>
-        </w:r>
-      </w:del>
+        <w:commentReference w:id="0"/>
+      </w:r>
     </w:p>
     <w:p>
       <w:pPr>
@@ -580,559 +300,243 @@
       <w:pPr>
         <w:spacing w:after="160"/>
         <w:rPr>
-          <w:del w:id="31" w:author="Rossella" w:date="2026-07-30T18:28:00Z" w16du:dateUtc="2026-07-30T22:28:00Z"/>
           <w:b/>
           <w:bCs/>
-          <w:color w:val="FF0000"/>
-        </w:rPr>
-      </w:pPr>
-      <w:del w:id="32" w:author="Rossella" w:date="2026-07-30T18:28:00Z" w16du:dateUtc="2026-07-30T22:28:00Z">
-        <w:r>
-          <w:rPr>
-            <w:color w:val="FF0000"/>
-          </w:rPr>
-          <w:delText>We repeated a few analyses for the two arrays in monkey S.</w:delText>
-        </w:r>
-        <w:r>
-          <w:rPr>
-            <w:b/>
-            <w:bCs/>
-            <w:color w:val="FF0000"/>
-          </w:rPr>
-          <w:delText xml:space="preserve"> </w:delText>
-        </w:r>
-      </w:del>
-    </w:p>
-    <w:p>
-      <w:pPr>
-        <w:spacing w:after="160"/>
-        <w:rPr>
-          <w:b/>
           <w:color w:val="4F81BD" w:themeColor="accent1"/>
-          <w:rPrChange w:id="33" w:author="Rossella" w:date="2026-07-30T18:28:00Z" w16du:dateUtc="2026-07-30T22:28:00Z">
-            <w:rPr>
-              <w:color w:val="0070C0"/>
-            </w:rPr>
-          </w:rPrChange>
-        </w:rPr>
-      </w:pPr>
-      <w:del w:id="34" w:author="Rossella" w:date="2026-07-30T18:28:00Z" w16du:dateUtc="2026-07-30T22:28:00Z">
-        <w:r>
-          <w:rPr>
-            <w:color w:val="FF0000"/>
-          </w:rPr>
-          <w:delText>We found that</w:delText>
-        </w:r>
-      </w:del>
-      <w:ins w:id="35" w:author="Rossella" w:date="2026-07-30T18:28:00Z" w16du:dateUtc="2026-07-30T22:28:00Z">
-        <w:r>
-          <w:rPr>
-            <w:b/>
-            <w:bCs/>
-            <w:color w:val="4F81BD" w:themeColor="accent1"/>
-          </w:rPr>
-          <w:t xml:space="preserve">CAN YOU DO THIS SIYU? </w:t>
-        </w:r>
-        <w:r>
-          <w:rPr>
-            <w:b/>
-            <w:bCs/>
-            <w:color w:val="4F81BD" w:themeColor="accent1"/>
-          </w:rPr>
-          <w:t>IF SO, which analysis we can repeat?</w:t>
-        </w:r>
-      </w:ins>
-      <w:r>
-        <w:rPr>
-          <w:b/>
-          <w:color w:val="4F81BD" w:themeColor="accent1"/>
-          <w:rPrChange w:id="36" w:author="Rossella" w:date="2026-07-30T18:28:00Z" w16du:dateUtc="2026-07-30T22:28:00Z">
-            <w:rPr>
-              <w:color w:val="FF0000"/>
-            </w:rPr>
-          </w:rPrChange>
-        </w:rPr>
-        <w:t xml:space="preserve"> </w:t>
-      </w:r>
-    </w:p>
-    <w:p>
-      <w:pPr>
-        <w:spacing w:after="160"/>
-        <w:rPr>
-          <w:color w:val="0070C0"/>
-        </w:rPr>
-      </w:pPr>
-      <w:r>
-        <w:rPr>
-          <w:color w:val="0070C0"/>
-        </w:rPr>
-        <w:br/>
-      </w:r>
-      <w:r>
-        <w:t xml:space="preserve"> 3. How much more training did Monkey S have compared to Monkey T? Perhaps this task would not evoke different strategies for temporal discounting if training was comparable between monkeys. Did early sessions with Monkey S reflect the strategy that Monkey T used, suggesting that increased experienced in the task resulted in shifting strategies?</w:t>
-      </w:r>
-    </w:p>
-    <w:p>
-      <w:pPr>
-        <w:spacing w:before="240" w:after="240"/>
-        <w:rPr>
-          <w:b/>
-          <w:color w:val="EE0000"/>
-          <w:rPrChange w:id="37" w:author="Rossella" w:date="2026-07-30T18:28:00Z" w16du:dateUtc="2026-07-30T22:28:00Z">
-            <w:rPr>
-              <w:color w:val="EE0000"/>
-              <w:highlight w:val="yellow"/>
-            </w:rPr>
-          </w:rPrChange>
-        </w:rPr>
-      </w:pPr>
-      <w:r>
-        <w:rPr>
-          <w:b/>
-          <w:color w:val="EE0000"/>
-          <w:rPrChange w:id="38" w:author="Rossella" w:date="2026-07-30T18:28:00Z" w16du:dateUtc="2026-07-30T22:28:00Z">
-            <w:rPr>
-              <w:color w:val="EE0000"/>
-              <w:highlight w:val="yellow"/>
-            </w:rPr>
-          </w:rPrChange>
-        </w:rPr>
-        <w:t xml:space="preserve">We appreciate this important comment. </w:t>
-      </w:r>
-      <w:ins w:id="39" w:author="Rossella" w:date="2026-07-30T18:28:00Z" w16du:dateUtc="2026-07-30T22:28:00Z">
-        <w:r>
-          <w:rPr>
-            <w:b/>
-            <w:bCs/>
-            <w:color w:val="EE0000"/>
-          </w:rPr>
-          <w:t xml:space="preserve">Training history may have contributed </w:t>
-        </w:r>
-        <w:r>
-          <w:rPr>
-            <w:b/>
-            <w:bCs/>
-            <w:color w:val="EE0000"/>
-          </w:rPr>
-          <w:t>to</w:t>
-        </w:r>
-        <w:r>
-          <w:rPr>
-            <w:b/>
-            <w:bCs/>
-            <w:color w:val="EE0000"/>
-          </w:rPr>
-          <w:t xml:space="preserve"> the differences. </w:t>
-        </w:r>
-      </w:ins>
-      <w:r>
-        <w:rPr>
-          <w:b/>
-          <w:color w:val="EE0000"/>
-          <w:rPrChange w:id="40" w:author="Rossella" w:date="2026-07-30T18:28:00Z" w16du:dateUtc="2026-07-30T22:28:00Z">
-            <w:rPr>
-              <w:color w:val="EE0000"/>
-              <w:highlight w:val="yellow"/>
-            </w:rPr>
-          </w:rPrChange>
-        </w:rPr>
-        <w:t xml:space="preserve">Unfortunately, we </w:t>
-      </w:r>
-      <w:del w:id="41" w:author="Rossella" w:date="2026-07-30T18:28:00Z" w16du:dateUtc="2026-07-30T22:28:00Z">
-        <w:r>
-          <w:rPr>
-            <w:color w:val="EE0000"/>
-            <w:highlight w:val="yellow"/>
-          </w:rPr>
-          <w:delText>miss this information in Monkey T. We still have some</w:delText>
-        </w:r>
-      </w:del>
-      <w:ins w:id="42" w:author="Rossella" w:date="2026-07-30T18:28:00Z" w16du:dateUtc="2026-07-30T22:28:00Z">
-        <w:r>
-          <w:rPr>
-            <w:b/>
-            <w:bCs/>
-            <w:color w:val="EE0000"/>
-          </w:rPr>
-          <w:t xml:space="preserve">only </w:t>
-        </w:r>
-        <w:r>
-          <w:rPr>
-            <w:b/>
-            <w:bCs/>
-            <w:color w:val="EE0000"/>
-          </w:rPr>
-          <w:t>have</w:t>
-        </w:r>
-      </w:ins>
-      <w:r>
-        <w:rPr>
-          <w:b/>
-          <w:color w:val="EE0000"/>
-          <w:rPrChange w:id="43" w:author="Rossella" w:date="2026-07-30T18:28:00Z" w16du:dateUtc="2026-07-30T22:28:00Z">
-            <w:rPr>
-              <w:color w:val="EE0000"/>
-              <w:highlight w:val="yellow"/>
-            </w:rPr>
-          </w:rPrChange>
-        </w:rPr>
-        <w:t xml:space="preserve"> information for Monkey S. </w:t>
-      </w:r>
-      <w:del w:id="44" w:author="Rossella" w:date="2026-07-30T18:28:00Z" w16du:dateUtc="2026-07-30T22:28:00Z">
-        <w:r>
-          <w:rPr>
-            <w:color w:val="EE0000"/>
-            <w:highlight w:val="yellow"/>
-          </w:rPr>
-          <w:delText>we checked the initial</w:delText>
-        </w:r>
-      </w:del>
-      <w:ins w:id="45" w:author="Rossella" w:date="2026-07-30T18:28:00Z" w16du:dateUtc="2026-07-30T22:28:00Z">
-        <w:r>
-          <w:rPr>
-            <w:b/>
-            <w:bCs/>
-            <w:color w:val="EE0000"/>
-          </w:rPr>
-          <w:t>We found that Monkey S at already the first</w:t>
-        </w:r>
-      </w:ins>
-      <w:r>
-        <w:rPr>
-          <w:b/>
-          <w:color w:val="EE0000"/>
-          <w:rPrChange w:id="46" w:author="Rossella" w:date="2026-07-30T18:28:00Z" w16du:dateUtc="2026-07-30T22:28:00Z">
-            <w:rPr>
-              <w:color w:val="EE0000"/>
-              <w:highlight w:val="yellow"/>
-            </w:rPr>
-          </w:rPrChange>
-        </w:rPr>
-        <w:t xml:space="preserve"> sessions </w:t>
-      </w:r>
-      <w:del w:id="47" w:author="Rossella" w:date="2026-07-30T18:28:00Z" w16du:dateUtc="2026-07-30T22:28:00Z">
-        <w:r>
-          <w:rPr>
-            <w:color w:val="EE0000"/>
-            <w:highlight w:val="yellow"/>
-          </w:rPr>
-          <w:delText>in Monkey S and we see that ?????</w:delText>
-        </w:r>
-      </w:del>
-      <w:ins w:id="48" w:author="Rossella" w:date="2026-07-30T18:28:00Z" w16du:dateUtc="2026-07-30T22:28:00Z">
-        <w:r>
-          <w:rPr>
-            <w:b/>
-            <w:bCs/>
-            <w:color w:val="EE0000"/>
-          </w:rPr>
-          <w:t xml:space="preserve">showed a different strategy than the one adopted by Monkey T if we think that the behavior of Monkey T reflects a less experienced one. </w:t>
-        </w:r>
-      </w:ins>
-    </w:p>
-    <w:p>
-      <w:pPr>
-        <w:spacing w:before="240" w:after="240"/>
-        <w:rPr>
-          <w:del w:id="49" w:author="Rossella" w:date="2026-07-30T18:28:00Z" w16du:dateUtc="2026-07-30T22:28:00Z"/>
-          <w:color w:val="EE0000"/>
-          <w:highlight w:val="yellow"/>
-        </w:rPr>
-      </w:pPr>
-      <w:del w:id="50" w:author="Rossella" w:date="2026-07-30T18:28:00Z" w16du:dateUtc="2026-07-30T22:28:00Z">
-        <w:r>
-          <w:rPr>
-            <w:b/>
-            <w:bCs/>
-            <w:color w:val="EE0000"/>
-            <w:highlight w:val="yellow"/>
-          </w:rPr>
-          <w:delText>I have</w:delText>
-        </w:r>
-      </w:del>
-      <w:ins w:id="51" w:author="Rossella" w:date="2026-07-30T18:28:00Z" w16du:dateUtc="2026-07-30T22:28:00Z">
-        <w:r>
-          <w:rPr>
-            <w:b/>
-            <w:bCs/>
-            <w:color w:val="EE0000"/>
-          </w:rPr>
-          <w:t>The point we want</w:t>
-        </w:r>
-      </w:ins>
-      <w:r>
-        <w:rPr>
-          <w:b/>
-          <w:color w:val="EE0000"/>
-          <w:rPrChange w:id="52" w:author="Rossella" w:date="2026-07-30T18:28:00Z" w16du:dateUtc="2026-07-30T22:28:00Z">
-            <w:rPr>
-              <w:b/>
-              <w:color w:val="EE0000"/>
-              <w:highlight w:val="yellow"/>
-            </w:rPr>
-          </w:rPrChange>
-        </w:rPr>
-        <w:t xml:space="preserve"> to </w:t>
-      </w:r>
-      <w:del w:id="53" w:author="Rossella" w:date="2026-07-30T18:28:00Z" w16du:dateUtc="2026-07-30T22:28:00Z">
-        <w:r>
-          <w:rPr>
-            <w:b/>
-            <w:bCs/>
-            <w:color w:val="EE0000"/>
-            <w:highlight w:val="yellow"/>
-          </w:rPr>
-          <w:delText>check the training of SEAM. I cannot retrieve the one of Tobias.</w:delText>
-        </w:r>
-        <w:r>
-          <w:rPr>
-            <w:color w:val="EE0000"/>
-            <w:highlight w:val="yellow"/>
-          </w:rPr>
-          <w:delText xml:space="preserve"> </w:delText>
-        </w:r>
-      </w:del>
-    </w:p>
-    <w:p>
-      <w:pPr>
-        <w:spacing w:before="240" w:after="240"/>
-        <w:rPr>
-          <w:ins w:id="54" w:author="Rossella" w:date="2026-07-30T18:28:00Z" w16du:dateUtc="2026-07-30T22:28:00Z"/>
+        </w:rPr>
+      </w:pPr>
+      <w:r>
+        <w:rPr>
           <w:b/>
           <w:bCs/>
-          <w:color w:val="EE0000"/>
-        </w:rPr>
-      </w:pPr>
-      <w:del w:id="55" w:author="Rossella" w:date="2026-07-30T18:28:00Z" w16du:dateUtc="2026-07-30T22:28:00Z">
-        <w:r>
-          <w:rPr>
-            <w:color w:val="EE0000"/>
-            <w:highlight w:val="yellow"/>
-          </w:rPr>
-          <w:delText>Nevertheless,</w:delText>
-        </w:r>
-      </w:del>
-      <w:ins w:id="56" w:author="Rossella" w:date="2026-07-30T18:28:00Z" w16du:dateUtc="2026-07-30T22:28:00Z">
-        <w:r>
-          <w:rPr>
-            <w:b/>
-            <w:bCs/>
-            <w:color w:val="EE0000"/>
-          </w:rPr>
-          <w:t>make</w:t>
-        </w:r>
-      </w:ins>
-      <w:r>
-        <w:rPr>
-          <w:b/>
-          <w:color w:val="EE0000"/>
-          <w:rPrChange w:id="57" w:author="Rossella" w:date="2026-07-30T18:28:00Z" w16du:dateUtc="2026-07-30T22:28:00Z">
-            <w:rPr>
-              <w:color w:val="EE0000"/>
-              <w:highlight w:val="yellow"/>
-            </w:rPr>
-          </w:rPrChange>
-        </w:rPr>
-        <w:t xml:space="preserve"> in the </w:t>
-      </w:r>
-      <w:del w:id="58" w:author="Rossella" w:date="2026-07-30T18:28:00Z" w16du:dateUtc="2026-07-30T22:28:00Z">
-        <w:r>
-          <w:rPr>
-            <w:color w:val="EE0000"/>
-            <w:highlight w:val="yellow"/>
-          </w:rPr>
-          <w:delText>dataset analyzed here, the two monkeys exhibited</w:delText>
-        </w:r>
-      </w:del>
-      <w:ins w:id="59" w:author="Rossella" w:date="2026-07-30T18:28:00Z" w16du:dateUtc="2026-07-30T22:28:00Z">
-        <w:r>
-          <w:rPr>
-            <w:b/>
-            <w:bCs/>
-            <w:color w:val="EE0000"/>
-          </w:rPr>
-          <w:t>manuscript is that</w:t>
-        </w:r>
-      </w:ins>
-      <w:r>
-        <w:rPr>
-          <w:b/>
-          <w:color w:val="EE0000"/>
-          <w:rPrChange w:id="60" w:author="Rossella" w:date="2026-07-30T18:28:00Z" w16du:dateUtc="2026-07-30T22:28:00Z">
-            <w:rPr>
-              <w:color w:val="EE0000"/>
-              <w:highlight w:val="yellow"/>
-            </w:rPr>
-          </w:rPrChange>
-        </w:rPr>
-        <w:t xml:space="preserve"> distinct behavioral strategies in the task</w:t>
-      </w:r>
-      <w:del w:id="61" w:author="Rossella" w:date="2026-07-30T18:28:00Z" w16du:dateUtc="2026-07-30T22:28:00Z">
-        <w:r>
-          <w:rPr>
-            <w:color w:val="EE0000"/>
-            <w:highlight w:val="yellow"/>
-          </w:rPr>
-          <w:delText>, and these differences</w:delText>
-        </w:r>
-      </w:del>
-      <w:r>
-        <w:rPr>
-          <w:b/>
-          <w:color w:val="EE0000"/>
-          <w:rPrChange w:id="62" w:author="Rossella" w:date="2026-07-30T18:28:00Z" w16du:dateUtc="2026-07-30T22:28:00Z">
-            <w:rPr>
-              <w:color w:val="EE0000"/>
-              <w:highlight w:val="yellow"/>
-            </w:rPr>
-          </w:rPrChange>
-        </w:rPr>
-        <w:t xml:space="preserve"> were </w:t>
-      </w:r>
-      <w:del w:id="63" w:author="Rossella" w:date="2026-07-30T18:28:00Z" w16du:dateUtc="2026-07-30T22:28:00Z">
-        <w:r>
-          <w:rPr>
-            <w:color w:val="EE0000"/>
-            <w:highlight w:val="yellow"/>
-          </w:rPr>
-          <w:delText>accompanied</w:delText>
-        </w:r>
-      </w:del>
-      <w:ins w:id="64" w:author="Rossella" w:date="2026-07-30T18:28:00Z" w16du:dateUtc="2026-07-30T22:28:00Z">
-        <w:r>
-          <w:rPr>
-            <w:b/>
-            <w:bCs/>
-            <w:color w:val="EE0000"/>
-          </w:rPr>
-          <w:t>sustained</w:t>
-        </w:r>
-      </w:ins>
-      <w:r>
-        <w:rPr>
-          <w:b/>
-          <w:color w:val="EE0000"/>
-          <w:rPrChange w:id="65" w:author="Rossella" w:date="2026-07-30T18:28:00Z" w16du:dateUtc="2026-07-30T22:28:00Z">
-            <w:rPr>
-              <w:color w:val="EE0000"/>
-              <w:highlight w:val="yellow"/>
-            </w:rPr>
-          </w:rPrChange>
-        </w:rPr>
-        <w:t xml:space="preserve"> by differences in neural coding. </w:t>
-      </w:r>
-      <w:del w:id="66" w:author="Rossella" w:date="2026-07-30T18:28:00Z" w16du:dateUtc="2026-07-30T22:28:00Z">
-        <w:r>
-          <w:rPr>
-            <w:color w:val="EE0000"/>
-            <w:highlight w:val="yellow"/>
-          </w:rPr>
-          <w:delText>Understanding</w:delText>
-        </w:r>
-      </w:del>
-    </w:p>
-    <w:p>
-      <w:pPr>
-        <w:spacing w:before="240" w:after="240"/>
-        <w:rPr>
-          <w:b/>
-          <w:color w:val="EE0000"/>
-          <w:rPrChange w:id="67" w:author="Rossella" w:date="2026-07-30T18:28:00Z" w16du:dateUtc="2026-07-30T22:28:00Z">
-            <w:rPr>
-              <w:color w:val="EE0000"/>
-              <w:highlight w:val="yellow"/>
-            </w:rPr>
-          </w:rPrChange>
-        </w:rPr>
-      </w:pPr>
-      <w:ins w:id="68" w:author="Rossella" w:date="2026-07-30T18:28:00Z" w16du:dateUtc="2026-07-30T22:28:00Z">
-        <w:r>
-          <w:rPr>
-            <w:b/>
-            <w:bCs/>
-            <w:color w:val="EE0000"/>
-          </w:rPr>
-          <w:t>Certainly, understanding whether and</w:t>
-        </w:r>
-      </w:ins>
-      <w:r>
-        <w:rPr>
-          <w:b/>
-          <w:color w:val="EE0000"/>
-          <w:rPrChange w:id="69" w:author="Rossella" w:date="2026-07-30T18:28:00Z" w16du:dateUtc="2026-07-30T22:28:00Z">
-            <w:rPr>
-              <w:color w:val="EE0000"/>
-              <w:highlight w:val="yellow"/>
-            </w:rPr>
-          </w:rPrChange>
-        </w:rPr>
-        <w:t xml:space="preserve"> how behavioral strategies and their neural correlates evolve with experience would require longitudinal studies tracking the same animals across different stages of training.</w:t>
-      </w:r>
-    </w:p>
-    <w:p>
-      <w:pPr>
-        <w:spacing w:after="160"/>
+          <w:color w:val="4F81BD" w:themeColor="accent1"/>
+          <w:highlight w:val="yellow"/>
+        </w:rPr>
+        <w:t>Siyu, will repeat Anova or Decoding?</w:t>
+      </w:r>
+      <w:r>
         <w:rPr>
           <w:b/>
           <w:bCs/>
-          <w:color w:val="EE0000"/>
-        </w:rPr>
-      </w:pPr>
-      <w:r>
-        <w:rPr>
-          <w:b/>
-          <w:color w:val="EE0000"/>
-          <w:rPrChange w:id="70" w:author="Rossella" w:date="2026-07-30T18:28:00Z" w16du:dateUtc="2026-07-30T22:28:00Z">
-            <w:rPr>
-              <w:color w:val="EE0000"/>
-            </w:rPr>
-          </w:rPrChange>
-        </w:rPr>
-        <w:t xml:space="preserve">We have clarified this argument in the discussion. </w:t>
-      </w:r>
-      <w:r>
+          <w:color w:val="4F81BD" w:themeColor="accent1"/>
+        </w:rPr>
+        <w:t xml:space="preserve"> </w:t>
+      </w:r>
+    </w:p>
+    <w:p>
+      <w:pPr>
+        <w:spacing w:after="160"/>
+        <w:rPr>
+          <w:color w:val="0070C0"/>
+        </w:rPr>
+      </w:pPr>
+      <w:r>
+        <w:rPr>
+          <w:color w:val="0070C0"/>
+        </w:rPr>
+        <w:br/>
+      </w:r>
+      <w:r>
+        <w:t xml:space="preserve"> 3. How much more training did Monkey S have compared to Monkey T? Perhaps this task would not evoke different strategies for temporal discounting if training was comparable between monkeys. Did early sessions with Monkey S reflect the strategy that Monkey T used, suggesting that increased experienced in the task resulted in shifting strategies?</w:t>
+      </w:r>
+    </w:p>
+    <w:p>
+      <w:pPr>
         <w:rPr>
           <w:b/>
           <w:bCs/>
-          <w:color w:val="EE0000"/>
-        </w:rPr>
-        <w:t>Please see:</w:t>
-      </w:r>
+          <w:color w:val="4F81BD" w:themeColor="accent1"/>
+        </w:rPr>
+      </w:pPr>
+      <w:r>
+        <w:rPr>
+          <w:b/>
+          <w:bCs/>
+          <w:color w:val="4F81BD" w:themeColor="accent1"/>
+        </w:rPr>
+        <w:t>We appreciate this important comment. The animals' training history may have contributed to the differences observed. Understanding how behavioral strategies and their neural correlates evolve with experience certainly requires longitudinal studies tracking the same animals across different stages of training, which are lacking here.</w:t>
+      </w:r>
+    </w:p>
+    <w:p>
+      <w:pPr>
+        <w:rPr>
+          <w:b/>
+          <w:bCs/>
+          <w:color w:val="4F81BD" w:themeColor="accent1"/>
+        </w:rPr>
+      </w:pPr>
+      <w:r>
+        <w:rPr>
+          <w:b/>
+          <w:bCs/>
+          <w:color w:val="4F81BD" w:themeColor="accent1"/>
+        </w:rPr>
+        <w:t xml:space="preserve">We have clarified this argument in the discussion. </w:t>
+      </w:r>
+    </w:p>
+    <w:p>
+      <w:pPr>
+        <w:rPr>
+          <w:b/>
+          <w:bCs/>
+          <w:color w:val="4F81BD" w:themeColor="accent1"/>
+        </w:rPr>
+      </w:pPr>
+      <w:r>
+        <w:rPr>
+          <w:b/>
+          <w:bCs/>
+          <w:color w:val="4F81BD" w:themeColor="accent1"/>
+        </w:rPr>
+        <w:t xml:space="preserve">We also corrected the previous part of the discussion in which we incorrectly stated that Monkey S had received more training than Monkey T; this was not the intention. What we meant was that it was possible that Monkey S may have had longer training than Monkey T. </w:t>
+      </w:r>
+      <w:r>
+        <w:rPr>
+          <w:b/>
+          <w:bCs/>
+          <w:color w:val="4F81BD" w:themeColor="accent1"/>
+        </w:rPr>
+        <w:t xml:space="preserve"> </w:t>
+      </w:r>
+    </w:p>
+    <w:p>
+      <w:pPr>
+        <w:rPr>
+          <w:b/>
+          <w:bCs/>
+          <w:color w:val="4F81BD" w:themeColor="accent1"/>
+        </w:rPr>
+      </w:pPr>
+      <w:r>
+        <w:rPr>
+          <w:b/>
+          <w:bCs/>
+          <w:color w:val="4F81BD" w:themeColor="accent1"/>
+        </w:rPr>
+        <w:t xml:space="preserve">Something that we cannot determine, because </w:t>
+      </w:r>
+      <w:r>
+        <w:rPr>
+          <w:b/>
+          <w:bCs/>
+          <w:color w:val="4F81BD" w:themeColor="accent1"/>
+        </w:rPr>
+        <w:t xml:space="preserve">we </w:t>
+      </w:r>
+      <w:r>
+        <w:rPr>
+          <w:b/>
+          <w:bCs/>
+          <w:color w:val="4F81BD" w:themeColor="accent1"/>
+        </w:rPr>
+        <w:t xml:space="preserve">only </w:t>
+      </w:r>
+      <w:r>
+        <w:rPr>
+          <w:b/>
+          <w:bCs/>
+          <w:color w:val="4F81BD" w:themeColor="accent1"/>
+        </w:rPr>
+        <w:t xml:space="preserve">have information </w:t>
+      </w:r>
+      <w:r>
+        <w:rPr>
+          <w:b/>
+          <w:bCs/>
+          <w:color w:val="4F81BD" w:themeColor="accent1"/>
+        </w:rPr>
+        <w:t xml:space="preserve">of initial training </w:t>
+      </w:r>
+      <w:r>
+        <w:rPr>
+          <w:b/>
+          <w:bCs/>
+          <w:color w:val="4F81BD" w:themeColor="accent1"/>
+        </w:rPr>
+        <w:t xml:space="preserve">for Monkey S. </w:t>
+      </w:r>
+      <w:r>
+        <w:rPr>
+          <w:b/>
+          <w:bCs/>
+          <w:color w:val="4F81BD" w:themeColor="accent1"/>
+        </w:rPr>
+        <w:t xml:space="preserve">We found that Monkey S at already the first </w:t>
+      </w:r>
+      <w:r>
+        <w:rPr>
+          <w:b/>
+          <w:bCs/>
+          <w:color w:val="4F81BD" w:themeColor="accent1"/>
+        </w:rPr>
+        <w:t xml:space="preserve">training </w:t>
+      </w:r>
+      <w:r>
+        <w:rPr>
+          <w:b/>
+          <w:bCs/>
+          <w:color w:val="4F81BD" w:themeColor="accent1"/>
+        </w:rPr>
+        <w:t xml:space="preserve">sessions showed a different strategy than the one adopted by Monkey T if we think that the behavior of Monkey T </w:t>
+      </w:r>
+      <w:r>
+        <w:rPr>
+          <w:b/>
+          <w:bCs/>
+          <w:color w:val="4F81BD" w:themeColor="accent1"/>
+        </w:rPr>
+        <w:t xml:space="preserve">may </w:t>
+      </w:r>
+      <w:r>
+        <w:rPr>
+          <w:b/>
+          <w:bCs/>
+          <w:color w:val="4F81BD" w:themeColor="accent1"/>
+        </w:rPr>
+        <w:t xml:space="preserve">reflect a less experienced one. </w:t>
+      </w:r>
+    </w:p>
+    <w:p>
+      <w:pPr>
+        <w:rPr>
+          <w:b/>
+          <w:bCs/>
+          <w:color w:val="4F81BD" w:themeColor="accent1"/>
+        </w:rPr>
+      </w:pPr>
     </w:p>
     <w:p>
       <w:pPr>
         <w:spacing w:after="160"/>
       </w:pPr>
       <w:r>
-        <w:t>4. It seems that the majority of the neural results presented are different between the two animals, which is understandable given the goal of the manuscript and the apparent behavioral differences between the two animals. However, it would be nice to have a positive control. Is there some aspect of the animal behavior and corresponding neural coding that is the same? Responses on opt in vs opt out? Errors? I am curious about those responses as well even if they aren't the same.</w:t>
+        <w:t xml:space="preserve">4. It seems that the majority of the neural results presented are different between the two animals, which is understandable given the goal of the manuscript and the apparent behavioral differences between the two animals. However, it would be nice to have a positive control. Is there some aspect of the animal behavior and corresponding neural coding that is the same? </w:t>
       </w:r>
     </w:p>
     <w:p>
       <w:pPr>
         <w:spacing w:after="160"/>
         <w:rPr>
-          <w:color w:val="FF0000"/>
-        </w:rPr>
-      </w:pPr>
-      <w:r>
-        <w:rPr>
-          <w:color w:val="FF0000"/>
-        </w:rPr>
-        <w:t xml:space="preserve">Thank you to the reviewer for this comment. As reported in figure 2 of the current manuscript, both monkeys rank the nine offers from lower to higher discounted value, with a similar pattern, showing that both animals rank the offers based on the delay and reward magnitude. Different offers with different delay and magnitude are accepted in a similar way, showing that animals attribute similar value. We found neural encoding of reward, delay and their interaction in both monkeys as shown in figure S1C-D and Fig S2 A-B. </w:t>
+          <w:b/>
+          <w:bCs/>
+          <w:color w:val="4F81BD" w:themeColor="accent1"/>
+        </w:rPr>
+      </w:pPr>
+      <w:r>
+        <w:rPr>
+          <w:b/>
+          <w:bCs/>
+          <w:color w:val="4F81BD" w:themeColor="accent1"/>
+        </w:rPr>
+        <w:t xml:space="preserve">Thank you to the reviewer for this comment. As shown in Figure 2 of the current manuscript, both monkeys more often chose offers with larger drops and shorter delays. Neural encodings of reward, delay and their interaction were found in both monkeys, as shown in Figures S1C-D and S2A-B. </w:t>
       </w:r>
     </w:p>
     <w:p>
       <w:pPr>
         <w:spacing w:after="160"/>
-        <w:rPr>
-          <w:color w:val="FF0000"/>
-        </w:rPr>
-      </w:pPr>
-      <w:r>
-        <w:rPr>
-          <w:color w:val="FF0000"/>
-        </w:rPr>
-        <w:t>We also found that in both monkeys Delay and Magnitude are inversely correlated, as shown in Figure 5, suggesting temporal discounting.</w:t>
+      </w:pPr>
+      <w:r>
+        <w:t>Responses on opt in vs opt out? Errors? I am curious about those responses as well even if they aren't the same.</w:t>
       </w:r>
     </w:p>
     <w:p>
@@ -1144,23 +548,12 @@
       </w:pPr>
       <w:r>
         <w:rPr>
-          <w:color w:val="FF0000"/>
-        </w:rPr>
-        <w:t xml:space="preserve">In both animals we did not find choice signal. </w:t>
-      </w:r>
-    </w:p>
-    <w:p>
-      <w:pPr>
-        <w:spacing w:after="160"/>
-        <w:rPr>
-          <w:color w:val="EE0000"/>
-        </w:rPr>
-      </w:pPr>
-      <w:r>
-        <w:rPr>
-          <w:color w:val="0070C0"/>
-        </w:rPr>
-        <w:t>4. Opt-in Opt-out (Siyu can check)</w:t>
+          <w:b/>
+          <w:bCs/>
+          <w:color w:val="4F81BD" w:themeColor="accent1"/>
+        </w:rPr>
+        <w:lastRenderedPageBreak/>
+        <w:t>To answer this question, we calculated the number of incomplete trials and categorized them as either those in which the animal released the bar during the cue period or within the first 100 ms of the go signal (Monkey S: 2% ± 0.3; Monkey T: 8% ± 0.8), or those in which the bar was never released (Monkey S: 2% ± 0.4; Monkey T: 6% ± 1.1; mean ± SEM).</w:t>
       </w:r>
     </w:p>
     <w:p>
@@ -1177,373 +570,127 @@
     </w:p>
     <w:p>
       <w:pPr>
-        <w:ind w:left="720"/>
-        <w:rPr>
-          <w:del w:id="71" w:author="Rossella" w:date="2026-07-30T18:28:00Z" w16du:dateUtc="2026-07-30T22:28:00Z"/>
-          <w:color w:val="0070C0"/>
-        </w:rPr>
-      </w:pPr>
-      <w:del w:id="72" w:author="Rossella" w:date="2026-07-30T18:28:00Z" w16du:dateUtc="2026-07-30T22:28:00Z">
-        <w:r>
-          <w:rPr>
-            <w:color w:val="0070C0"/>
-          </w:rPr>
-          <w:delText>1.</w:delText>
-        </w:r>
-        <w:r>
-          <w:rPr>
-            <w:rFonts w:ascii="Times New Roman" w:eastAsia="Times New Roman" w:hAnsi="Times New Roman" w:cs="Times New Roman"/>
-            <w:color w:val="0070C0"/>
-            <w:sz w:val="14"/>
-            <w:szCs w:val="14"/>
-          </w:rPr>
-          <w:delText xml:space="preserve">      </w:delText>
-        </w:r>
-        <w:r>
-          <w:rPr>
-            <w:color w:val="0070C0"/>
-          </w:rPr>
-          <w:delText>Acknowledge the conceptual confound of visual vs delay/drop</w:delText>
-        </w:r>
-      </w:del>
-    </w:p>
-    <w:p>
-      <w:pPr>
         <w:spacing w:after="160"/>
-        <w:ind w:left="720"/>
-        <w:rPr>
-          <w:del w:id="73" w:author="Rossella" w:date="2026-07-30T18:28:00Z" w16du:dateUtc="2026-07-30T22:28:00Z"/>
-          <w:color w:val="0070C0"/>
-        </w:rPr>
-      </w:pPr>
-      <w:del w:id="74" w:author="Rossella" w:date="2026-07-30T18:28:00Z" w16du:dateUtc="2026-07-30T22:28:00Z">
-        <w:r>
-          <w:rPr>
-            <w:color w:val="0070C0"/>
-          </w:rPr>
-          <w:delText>2.</w:delText>
-        </w:r>
-        <w:r>
-          <w:rPr>
-            <w:rFonts w:ascii="Times New Roman" w:eastAsia="Times New Roman" w:hAnsi="Times New Roman" w:cs="Times New Roman"/>
-            <w:color w:val="0070C0"/>
-            <w:sz w:val="14"/>
-            <w:szCs w:val="14"/>
-          </w:rPr>
-          <w:delText xml:space="preserve">      </w:delText>
-        </w:r>
-        <w:r>
-          <w:rPr>
-            <w:color w:val="0070C0"/>
-          </w:rPr>
-          <w:delText>Order of delay/drop suggests it’s more likely not a visual effect</w:delText>
-        </w:r>
-      </w:del>
-    </w:p>
-    <w:p>
-      <w:pPr>
-        <w:spacing w:after="160"/>
-        <w:rPr>
-          <w:ins w:id="75" w:author="Rossella" w:date="2026-07-30T18:28:00Z" w16du:dateUtc="2026-07-30T22:28:00Z"/>
+        <w:rPr>
           <w:b/>
           <w:bCs/>
-          <w:color w:val="EE0000"/>
-        </w:rPr>
-      </w:pPr>
-      <w:r>
-        <w:rPr>
-          <w:b/>
-          <w:color w:val="EE0000"/>
-          <w:rPrChange w:id="76" w:author="Rossella" w:date="2026-07-30T18:28:00Z" w16du:dateUtc="2026-07-30T22:28:00Z">
-            <w:rPr>
-              <w:color w:val="EE0000"/>
-            </w:rPr>
-          </w:rPrChange>
-        </w:rPr>
-        <w:t xml:space="preserve">We thank the reviewer for this point. Because the cue set was constructed by recombining a limited set of simple geometric features encoding reward and delay, visual properties are inherently coupled to task variables. </w:t>
-      </w:r>
-    </w:p>
-    <w:p>
-      <w:pPr>
-        <w:spacing w:after="160"/>
-        <w:rPr>
-          <w:b/>
-          <w:color w:val="EE0000"/>
-          <w:rPrChange w:id="77" w:author="Rossella" w:date="2026-07-30T18:28:00Z" w16du:dateUtc="2026-07-30T22:28:00Z">
-            <w:rPr>
-              <w:color w:val="EE0000"/>
-            </w:rPr>
-          </w:rPrChange>
-        </w:rPr>
-      </w:pPr>
-      <w:r>
-        <w:rPr>
-          <w:b/>
-          <w:color w:val="EE0000"/>
-          <w:rPrChange w:id="78" w:author="Rossella" w:date="2026-07-30T18:28:00Z" w16du:dateUtc="2026-07-30T22:28:00Z">
-            <w:rPr>
-              <w:color w:val="EE0000"/>
-            </w:rPr>
-          </w:rPrChange>
-        </w:rPr>
-        <w:t>Therefore, as</w:t>
-      </w:r>
-      <w:del w:id="79" w:author="Rossella" w:date="2026-07-30T18:28:00Z" w16du:dateUtc="2026-07-30T22:28:00Z">
-        <w:r>
-          <w:rPr>
-            <w:color w:val="EE0000"/>
-          </w:rPr>
-          <w:delText xml:space="preserve"> a</w:delText>
-        </w:r>
-      </w:del>
-      <w:r>
-        <w:rPr>
-          <w:b/>
-          <w:color w:val="EE0000"/>
-          <w:rPrChange w:id="80" w:author="Rossella" w:date="2026-07-30T18:28:00Z" w16du:dateUtc="2026-07-30T22:28:00Z">
-            <w:rPr>
-              <w:color w:val="EE0000"/>
-            </w:rPr>
-          </w:rPrChange>
-        </w:rPr>
-        <w:t xml:space="preserve"> </w:t>
-      </w:r>
-      <w:r>
-        <w:rPr>
-          <w:b/>
-          <w:color w:val="EE0000"/>
-          <w:rPrChange w:id="81" w:author="Rossella" w:date="2026-07-30T18:28:00Z" w16du:dateUtc="2026-07-30T22:28:00Z">
-            <w:rPr>
-              <w:color w:val="EE0000"/>
-            </w:rPr>
-          </w:rPrChange>
-        </w:rPr>
-        <w:t>partial</w:t>
-      </w:r>
-      <w:r>
-        <w:rPr>
-          <w:b/>
-          <w:color w:val="EE0000"/>
-          <w:rPrChange w:id="82" w:author="Rossella" w:date="2026-07-30T18:28:00Z" w16du:dateUtc="2026-07-30T22:28:00Z">
-            <w:rPr>
-              <w:color w:val="EE0000"/>
-            </w:rPr>
-          </w:rPrChange>
-        </w:rPr>
-        <w:t xml:space="preserve"> control, we compared neuronal activity elicited by the same offer cue in trials in which the offer was ultimately accepted versus rejected. We did not observe significant differences between these conditions, indicating that the neuronal responses during the offer period were not modulated by the subsequent choice. We acknowledge, however, that this analysis does not rule out the possibility that part of the observed activity reflects visual processing of the cue, and we have added this point as a limitation in the manuscript. </w:t>
-      </w:r>
-    </w:p>
-    <w:p>
-      <w:pPr>
-        <w:spacing w:after="160"/>
-        <w:rPr>
-          <w:del w:id="83" w:author="Rossella" w:date="2026-07-30T18:28:00Z" w16du:dateUtc="2026-07-30T22:28:00Z"/>
-          <w:color w:val="EE0000"/>
-        </w:rPr>
-      </w:pPr>
-      <w:del w:id="84" w:author="Rossella" w:date="2026-07-30T18:28:00Z" w16du:dateUtc="2026-07-30T22:28:00Z">
-        <w:r>
-          <w:rPr>
-            <w:color w:val="EE0000"/>
-          </w:rPr>
-          <w:delText xml:space="preserve">Please see lines ??-??.  </w:delText>
-        </w:r>
-      </w:del>
-    </w:p>
-    <w:p>
-      <w:pPr>
-        <w:spacing w:after="160"/>
-        <w:rPr>
-          <w:ins w:id="85" w:author="Rossella" w:date="2026-07-30T18:28:00Z" w16du:dateUtc="2026-07-30T22:28:00Z"/>
+          <w:color w:val="4F81BD" w:themeColor="accent1"/>
+        </w:rPr>
+      </w:pPr>
+      <w:r>
+        <w:rPr>
           <w:b/>
           <w:bCs/>
-          <w:color w:val="EE0000"/>
-        </w:rPr>
-      </w:pPr>
-      <w:ins w:id="86" w:author="Rossella" w:date="2026-07-30T18:28:00Z" w16du:dateUtc="2026-07-30T22:28:00Z">
-        <w:r>
-          <w:rPr>
-            <w:b/>
-            <w:bCs/>
-            <w:color w:val="EE0000"/>
-          </w:rPr>
-          <w:t>In addition, since each cue simultaneously contains both the reward- and delay-related visual components, if neural activity primarily reflected the visual properties of the cue, one would expect information about these two cue dimensions to emerge with similar temporal dynamics following cue onset. Instead, we observe that delay and reward representations emerge</w:t>
-        </w:r>
-        <w:r>
-          <w:rPr>
-            <w:b/>
-            <w:bCs/>
-            <w:color w:val="EE0000"/>
-          </w:rPr>
-          <w:t xml:space="preserve"> </w:t>
-        </w:r>
-        <w:r>
-          <w:rPr>
-            <w:b/>
-            <w:bCs/>
-            <w:color w:val="EE0000"/>
-          </w:rPr>
-          <w:t>differently, suggesting that the activity reflects the processing of task-relevant information rather than simply the visual features of the stimuli.</w:t>
-        </w:r>
-      </w:ins>
+          <w:color w:val="4F81BD" w:themeColor="accent1"/>
+        </w:rPr>
+        <w:t xml:space="preserve">We thank the reviewer for this point. Because the cue set was constructed by recombining a limited set of simple geometric features encoding reward and delay, visual properties are inherently coupled to task variables. </w:t>
+      </w:r>
     </w:p>
     <w:p>
       <w:pPr>
         <w:spacing w:after="160"/>
-      </w:pPr>
-      <w:r>
-        <w:t xml:space="preserve">2. The explanation (in words) of Model 2 was even more simple and straightforward in the methods, whereas it was a little </w:t>
-      </w:r>
-      <w:r>
         <w:rPr>
           <w:b/>
           <w:bCs/>
+          <w:color w:val="4F81BD" w:themeColor="accent1"/>
+        </w:rPr>
+      </w:pPr>
+      <w:r>
+        <w:rPr>
+          <w:b/>
+          <w:bCs/>
+          <w:color w:val="4F81BD" w:themeColor="accent1"/>
+        </w:rPr>
+        <w:t xml:space="preserve">Therefore, as </w:t>
+      </w:r>
+      <w:r>
+        <w:rPr>
+          <w:b/>
+          <w:bCs/>
+          <w:color w:val="4F81BD" w:themeColor="accent1"/>
+        </w:rPr>
+        <w:t>partial</w:t>
+      </w:r>
+      <w:r>
+        <w:rPr>
+          <w:b/>
+          <w:bCs/>
+          <w:color w:val="4F81BD" w:themeColor="accent1"/>
+        </w:rPr>
+        <w:t xml:space="preserve"> control, we compared neuronal activity elicited by the same offer cue in trials in which the offer was ultimately accepted versus rejected. We did not observe significant differences between these conditions, indicating that the neuronal responses during the offer period were not modulated by the subsequent choice. We acknowledge, however, that this analysis does not rule out the possibility that part of the observed activity reflects visual processing of the cue, and we have added this point as a limitation in the manuscript. </w:t>
+      </w:r>
+    </w:p>
+    <w:p>
+      <w:pPr>
+        <w:spacing w:after="160"/>
+        <w:rPr>
+          <w:b/>
+          <w:bCs/>
+          <w:color w:val="4F81BD" w:themeColor="accent1"/>
+        </w:rPr>
+      </w:pPr>
+      <w:r>
+        <w:rPr>
+          <w:b/>
+          <w:bCs/>
+          <w:color w:val="4F81BD" w:themeColor="accent1"/>
+        </w:rPr>
+        <w:t>In addition, since each cue simultaneously contains both the reward- and delay-related visual components, if neural activity primarily reflected the visual properties of the cue, one would expect information about these two cue dimensions to emerge with similar temporal dynamics following cue onset. Instead, we observe that delay and reward representations emerge</w:t>
+      </w:r>
+      <w:r>
+        <w:rPr>
+          <w:b/>
+          <w:bCs/>
+          <w:color w:val="4F81BD" w:themeColor="accent1"/>
+        </w:rPr>
+        <w:t xml:space="preserve"> </w:t>
+      </w:r>
+      <w:r>
+        <w:rPr>
+          <w:b/>
+          <w:bCs/>
+          <w:color w:val="4F81BD" w:themeColor="accent1"/>
+        </w:rPr>
+        <w:t>differently, suggesting that the activity reflects the processing of task-relevant information rather than simply the visual features of the stimuli.</w:t>
+      </w:r>
+    </w:p>
+    <w:p>
+      <w:pPr>
+        <w:spacing w:after="160"/>
+      </w:pPr>
+      <w:r>
+        <w:t xml:space="preserve">2. The explanation (in words) of Model 2 was even more simple and straightforward in the methods, whereas it was a little </w:t>
+      </w:r>
+      <w:r>
+        <w:rPr>
+          <w:b/>
+          <w:bCs/>
         </w:rPr>
         <w:t>hard to follow in the results.</w:t>
       </w:r>
       <w:r>
         <w:t xml:space="preserve"> Would recommend clarifying/rephrasing in the results.</w:t>
       </w:r>
-    </w:p>
-    <w:p>
-      <w:pPr>
-        <w:shd w:val="clear" w:color="auto" w:fill="FFFFFF"/>
-        <w:spacing w:line="480" w:lineRule="auto"/>
-        <w:rPr>
-          <w:del w:id="87" w:author="Rossella" w:date="2026-07-30T18:28:00Z" w16du:dateUtc="2026-07-30T22:28:00Z"/>
-          <w:rFonts w:ascii="Times New Roman" w:eastAsia="Times New Roman" w:hAnsi="Times New Roman" w:cs="Times New Roman"/>
-          <w:color w:val="FF0000"/>
-          <w:sz w:val="24"/>
-          <w:szCs w:val="24"/>
-        </w:rPr>
-      </w:pPr>
-      <w:r>
-        <w:rPr>
-          <w:b/>
-          <w:color w:val="FF0000"/>
-          <w:rPrChange w:id="88" w:author="Rossella" w:date="2026-07-30T18:28:00Z" w16du:dateUtc="2026-07-30T22:28:00Z">
-            <w:rPr>
-              <w:rFonts w:ascii="Times New Roman" w:hAnsi="Times New Roman"/>
-              <w:color w:val="FF0000"/>
-              <w:sz w:val="24"/>
-            </w:rPr>
-          </w:rPrChange>
-        </w:rPr>
-        <w:t xml:space="preserve">We thank the reviewer for asking us to clarify this point. We have revised the Results section accordingly as </w:t>
-      </w:r>
-      <w:del w:id="89" w:author="Rossella" w:date="2026-07-30T18:28:00Z" w16du:dateUtc="2026-07-30T22:28:00Z">
-        <w:r>
-          <w:rPr>
-            <w:rFonts w:ascii="Times New Roman" w:eastAsia="Times New Roman" w:hAnsi="Times New Roman" w:cs="Times New Roman"/>
-            <w:color w:val="FF0000"/>
-            <w:sz w:val="24"/>
-            <w:szCs w:val="24"/>
-          </w:rPr>
-          <w:delText xml:space="preserve">follows: </w:delText>
-        </w:r>
-      </w:del>
     </w:p>
     <w:p>
       <w:pPr>
         <w:shd w:val="clear" w:color="auto" w:fill="FFFFFF"/>
         <w:spacing w:line="240" w:lineRule="auto"/>
         <w:rPr>
+          <w:rFonts w:eastAsia="Times New Roman"/>
           <w:b/>
-          <w:color w:val="FF0000"/>
-          <w:rPrChange w:id="90" w:author="Rossella" w:date="2026-07-30T18:28:00Z" w16du:dateUtc="2026-07-30T22:28:00Z">
-            <w:rPr>
-              <w:i/>
-              <w:color w:val="FF0000"/>
-            </w:rPr>
-          </w:rPrChange>
-        </w:rPr>
-        <w:pPrChange w:id="91" w:author="Rossella" w:date="2026-07-30T18:28:00Z" w16du:dateUtc="2026-07-30T22:28:00Z">
-          <w:pPr>
-            <w:shd w:val="clear" w:color="auto" w:fill="FFFFFF"/>
-            <w:spacing w:line="480" w:lineRule="auto"/>
-          </w:pPr>
-        </w:pPrChange>
-      </w:pPr>
-      <w:commentRangeStart w:id="92"/>
-      <w:commentRangeStart w:id="93"/>
-      <w:del w:id="94" w:author="Rossella" w:date="2026-07-30T18:28:00Z" w16du:dateUtc="2026-07-30T22:28:00Z">
-        <w:r>
-          <w:rPr>
-            <w:rFonts w:ascii="Times New Roman" w:eastAsia="Times New Roman" w:hAnsi="Times New Roman" w:cs="Times New Roman"/>
-            <w:i/>
-            <w:iCs/>
-            <w:color w:val="FF0000"/>
-            <w:sz w:val="24"/>
-            <w:szCs w:val="24"/>
-          </w:rPr>
-          <w:delText>The second simplistic strategy (Model 2; see Methods) assigns a bias directly to the go signal and chooses to accept if the combined value of the delayed reward offer and the go signal bias exceeds a threshold, and chooses to reject otherwise. The go signal bias approximates how much the go signal shifts the tendency to accept or reject an offer and assumes that this shift is independent of the offer value. In other words, the go signal produces the same increase or decrease in acceptance tendency for both favorable and unfavorable offers.</w:delText>
-        </w:r>
-      </w:del>
-      <w:ins w:id="95" w:author="Rossella" w:date="2026-07-30T18:28:00Z" w16du:dateUtc="2026-07-30T22:28:00Z">
-        <w:r>
-          <w:rPr>
-            <w:rFonts w:eastAsia="Times New Roman"/>
-            <w:b/>
-            <w:bCs/>
-            <w:color w:val="FF0000"/>
-          </w:rPr>
-          <w:t>follow:</w:t>
-        </w:r>
-      </w:ins>
-      <w:r>
-        <w:rPr>
+          <w:bCs/>
+          <w:color w:val="4F81BD" w:themeColor="accent1"/>
+        </w:rPr>
+      </w:pPr>
+      <w:r>
+        <w:rPr>
+          <w:rFonts w:eastAsia="Times New Roman"/>
           <w:b/>
-          <w:color w:val="FF0000"/>
-          <w:rPrChange w:id="96" w:author="Rossella" w:date="2026-07-30T18:28:00Z" w16du:dateUtc="2026-07-30T22:28:00Z">
-            <w:rPr>
-              <w:rFonts w:ascii="Times New Roman" w:hAnsi="Times New Roman"/>
-              <w:i/>
-              <w:color w:val="FF0000"/>
-              <w:sz w:val="24"/>
-            </w:rPr>
-          </w:rPrChange>
-        </w:rPr>
-        <w:t xml:space="preserve"> </w:t>
-      </w:r>
-      <w:commentRangeEnd w:id="92"/>
-      <w:r>
-        <w:rPr>
-          <w:rStyle w:val="CommentReference"/>
-          <w:b/>
-          <w:color w:val="FF0000"/>
-          <w:sz w:val="22"/>
-          <w:szCs w:val="22"/>
-          <w:rPrChange w:id="97" w:author="Rossella" w:date="2026-07-30T18:28:00Z" w16du:dateUtc="2026-07-30T22:28:00Z">
-            <w:rPr>
-              <w:rStyle w:val="CommentReference"/>
-              <w:i/>
-              <w:color w:val="FF0000"/>
-              <w:sz w:val="22"/>
-              <w:szCs w:val="22"/>
-            </w:rPr>
-          </w:rPrChange>
-        </w:rPr>
-        <w:commentReference w:id="92"/>
-      </w:r>
-      <w:commentRangeEnd w:id="93"/>
-      <w:r>
-        <w:rPr>
-          <w:rStyle w:val="CommentReference"/>
-          <w:b/>
-          <w:color w:val="FF0000"/>
-          <w:sz w:val="22"/>
-          <w:szCs w:val="22"/>
-          <w:rPrChange w:id="98" w:author="Rossella" w:date="2026-07-30T18:28:00Z" w16du:dateUtc="2026-07-30T22:28:00Z">
-            <w:rPr>
-              <w:rStyle w:val="CommentReference"/>
-              <w:i/>
-              <w:color w:val="FF0000"/>
-              <w:sz w:val="22"/>
-              <w:szCs w:val="22"/>
-            </w:rPr>
-          </w:rPrChange>
-        </w:rPr>
-        <w:commentReference w:id="93"/>
+          <w:bCs/>
+          <w:color w:val="4F81BD" w:themeColor="accent1"/>
+        </w:rPr>
+        <w:t xml:space="preserve">We thank the reviewer for asking us to clarify this point. We have revised the Results section accordingly as follow: </w:t>
       </w:r>
     </w:p>
     <w:p>
@@ -1566,126 +713,21 @@
     <w:p>
       <w:pPr>
         <w:spacing w:after="160"/>
-        <w:rPr>
-          <w:ins w:id="99" w:author="Rossella" w:date="2026-07-30T18:28:00Z" w16du:dateUtc="2026-07-30T22:28:00Z"/>
-        </w:rPr>
-      </w:pPr>
-      <w:del w:id="100" w:author="Rossella" w:date="2026-07-30T18:28:00Z" w16du:dateUtc="2026-07-30T22:28:00Z">
-        <w:r>
-          <w:rPr>
-            <w:color w:val="FF0000"/>
-          </w:rPr>
-          <w:delText>We can make it larger, although we also write holding and release.</w:delText>
-        </w:r>
-        <w:r>
-          <w:delText xml:space="preserve"> </w:delText>
-        </w:r>
-        <w:r>
-          <w:rPr>
-            <w:color w:val="EE0000"/>
-          </w:rPr>
-          <w:br/>
-        </w:r>
-        <w:r>
-          <w:rPr>
-            <w:color w:val="EE0000"/>
-          </w:rPr>
-          <w:br/>
-        </w:r>
-        <w:r>
-          <w:rPr>
-            <w:color w:val="EE0000"/>
-          </w:rPr>
-          <w:br/>
-        </w:r>
-      </w:del>
+      </w:pPr>
     </w:p>
     <w:p>
       <w:pPr>
         <w:spacing w:after="160"/>
-        <w:rPr>
-          <w:ins w:id="101" w:author="Rossella" w:date="2026-07-30T18:28:00Z" w16du:dateUtc="2026-07-30T22:28:00Z"/>
-        </w:rPr>
       </w:pPr>
     </w:p>
     <w:p>
       <w:pPr>
         <w:spacing w:after="160"/>
-        <w:rPr>
-          <w:ins w:id="102" w:author="Rossella" w:date="2026-07-30T18:28:00Z" w16du:dateUtc="2026-07-30T22:28:00Z"/>
-        </w:rPr>
-      </w:pPr>
-    </w:p>
-    <w:p>
-      <w:pPr>
-        <w:spacing w:after="160"/>
-        <w:rPr>
-          <w:ins w:id="103" w:author="Rossella" w:date="2026-07-30T18:28:00Z" w16du:dateUtc="2026-07-30T22:28:00Z"/>
-        </w:rPr>
-      </w:pPr>
-    </w:p>
-    <w:p>
-      <w:pPr>
-        <w:spacing w:after="160"/>
-        <w:rPr>
-          <w:ins w:id="104" w:author="Rossella" w:date="2026-07-30T18:28:00Z" w16du:dateUtc="2026-07-30T22:28:00Z"/>
-        </w:rPr>
-      </w:pPr>
-    </w:p>
-    <w:p>
-      <w:pPr>
-        <w:spacing w:after="160"/>
-        <w:rPr>
-          <w:ins w:id="105" w:author="Rossella" w:date="2026-07-30T18:28:00Z" w16du:dateUtc="2026-07-30T22:28:00Z"/>
-        </w:rPr>
-      </w:pPr>
-    </w:p>
-    <w:p>
-      <w:pPr>
-        <w:spacing w:after="160"/>
-        <w:rPr>
-          <w:ins w:id="106" w:author="Rossella" w:date="2026-07-30T18:28:00Z" w16du:dateUtc="2026-07-30T22:28:00Z"/>
-        </w:rPr>
-      </w:pPr>
-    </w:p>
-    <w:p>
-      <w:pPr>
-        <w:spacing w:after="160"/>
-        <w:rPr>
-          <w:ins w:id="107" w:author="Rossella" w:date="2026-07-30T18:28:00Z" w16du:dateUtc="2026-07-30T22:28:00Z"/>
-        </w:rPr>
-      </w:pPr>
-    </w:p>
-    <w:p>
-      <w:pPr>
-        <w:spacing w:after="160"/>
-        <w:rPr>
-          <w:ins w:id="108" w:author="Rossella" w:date="2026-07-30T18:28:00Z" w16du:dateUtc="2026-07-30T22:28:00Z"/>
-        </w:rPr>
-      </w:pPr>
-    </w:p>
-    <w:p>
-      <w:pPr>
-        <w:spacing w:after="160"/>
-        <w:rPr>
-          <w:ins w:id="109" w:author="Rossella" w:date="2026-07-30T18:28:00Z" w16du:dateUtc="2026-07-30T22:28:00Z"/>
-        </w:rPr>
-      </w:pPr>
-    </w:p>
-    <w:p>
-      <w:pPr>
-        <w:spacing w:after="160"/>
-        <w:rPr>
-          <w:rPrChange w:id="110" w:author="Rossella" w:date="2026-07-30T18:28:00Z" w16du:dateUtc="2026-07-30T22:28:00Z">
-            <w:rPr>
-              <w:color w:val="EE0000"/>
-            </w:rPr>
-          </w:rPrChange>
-        </w:rPr>
-      </w:pPr>
-    </w:p>
-    <w:p>
-      <w:r>
+      </w:pPr>
+    </w:p>
+    <w:p>
+      <w:r>
+        <w:lastRenderedPageBreak/>
         <w:t>Reviewer #2: This review identifies several areas where the manuscript would benefit from clearer conceptual and analytical presentation. The main concerns are that the computational models are not specified sufficiently to evaluate the proposed decision processes, key neural analysis terms and methods require clearer definition, and the link between go-signal-related neural activity, recalculated value, and behavioral strategy remains underdeveloped. Overall, the manuscript addresses an interesting question, but stronger model clarity, methodological transparency, and tighter integration between behavioral and neural findings would substantially improve the interpretation of the results.</w:t>
       </w:r>
       <w:r>
@@ -1837,7 +879,6 @@
         <w:spacing w:line="480" w:lineRule="auto"/>
         <w:ind w:firstLine="360"/>
         <w:rPr>
-          <w:del w:id="111" w:author="Rossella" w:date="2026-07-30T18:28:00Z" w16du:dateUtc="2026-07-30T22:28:00Z"/>
           <w:rFonts w:ascii="Times New Roman" w:eastAsia="Times New Roman" w:hAnsi="Times New Roman" w:cs="Times New Roman"/>
           <w:sz w:val="24"/>
           <w:szCs w:val="24"/>
@@ -1849,38 +890,14 @@
         </w:rPr>
         <w:t>“</w:t>
       </w:r>
-    </w:p>
-    <w:p>
-      <w:pPr>
-        <w:spacing w:line="480" w:lineRule="auto"/>
-        <w:ind w:firstLine="360"/>
-        <w:rPr>
-          <w:rFonts w:ascii="Times New Roman" w:hAnsi="Times New Roman"/>
-          <w:sz w:val="24"/>
-          <w:rPrChange w:id="112" w:author="Rossella" w:date="2026-07-30T18:28:00Z" w16du:dateUtc="2026-07-30T22:28:00Z">
-            <w:rPr>
-              <w:rFonts w:ascii="Times New Roman" w:hAnsi="Times New Roman"/>
-              <w:color w:val="0070C0"/>
-              <w:sz w:val="24"/>
-            </w:rPr>
-          </w:rPrChange>
-        </w:rPr>
-        <w:pPrChange w:id="113" w:author="Rossella" w:date="2026-07-30T18:28:00Z" w16du:dateUtc="2026-07-30T22:28:00Z">
-          <w:pPr>
-            <w:spacing w:line="480" w:lineRule="auto"/>
-          </w:pPr>
-        </w:pPrChange>
-      </w:pPr>
-      <w:ins w:id="114" w:author="Rossella" w:date="2026-07-30T18:28:00Z" w16du:dateUtc="2026-07-30T22:28:00Z">
-        <w:r>
-          <w:rPr>
-            <w:rFonts w:ascii="Times New Roman" w:eastAsia="Times New Roman" w:hAnsi="Times New Roman" w:cs="Times New Roman"/>
-            <w:sz w:val="24"/>
-            <w:szCs w:val="24"/>
-          </w:rPr>
-          <w:t xml:space="preserve"> </w:t>
-        </w:r>
-      </w:ins>
+      <w:r>
+        <w:rPr>
+          <w:rFonts w:ascii="Times New Roman" w:eastAsia="Times New Roman" w:hAnsi="Times New Roman" w:cs="Times New Roman"/>
+          <w:sz w:val="24"/>
+          <w:szCs w:val="24"/>
+        </w:rPr>
+        <w:t xml:space="preserve"> </w:t>
+      </w:r>
       <w:r>
         <w:rPr>
           <w:rFonts w:ascii="Times New Roman" w:eastAsia="Times New Roman" w:hAnsi="Times New Roman" w:cs="Times New Roman"/>
@@ -2145,6 +1162,7 @@
               <w:rFonts w:ascii="Cambria Math" w:eastAsia="Cambria Math" w:hAnsi="Cambria Math" w:cs="Cambria Math"/>
               <w:color w:val="0070C0"/>
             </w:rPr>
+            <w:lastRenderedPageBreak/>
             <m:t>p</m:t>
           </m:r>
           <m:d>
@@ -2598,7 +1616,6 @@
       <w:pPr>
         <w:spacing w:line="480" w:lineRule="auto"/>
         <w:rPr>
-          <w:del w:id="115" w:author="Rossella" w:date="2026-07-30T18:28:00Z" w16du:dateUtc="2026-07-30T22:28:00Z"/>
           <w:rFonts w:ascii="Times New Roman" w:eastAsia="Times New Roman" w:hAnsi="Times New Roman" w:cs="Times New Roman"/>
           <w:color w:val="0070C0"/>
           <w:sz w:val="24"/>
@@ -2607,13 +1624,11 @@
       </w:pPr>
       <m:oMath>
         <m:r>
-          <w:ins w:id="116" w:author="Rossella" w:date="2026-07-30T18:28:00Z" w16du:dateUtc="2026-07-30T22:28:00Z">
-            <w:rPr>
-              <w:rFonts w:ascii="Cambria Math" w:eastAsia="Cambria Math" w:hAnsi="Cambria Math" w:cs="Cambria Math"/>
-              <w:color w:val="0070C0"/>
-            </w:rPr>
-            <m:t xml:space="preserve"> </m:t>
-          </w:ins>
+          <w:rPr>
+            <w:rFonts w:ascii="Cambria Math" w:eastAsia="Cambria Math" w:hAnsi="Cambria Math" w:cs="Cambria Math"/>
+            <w:color w:val="0070C0"/>
+          </w:rPr>
+          <m:t xml:space="preserve"> </m:t>
         </m:r>
       </m:oMath>
       <w:r>
@@ -2648,35 +1663,15 @@
         </w:rPr>
         <w:t xml:space="preserve"> is the hyperbolic discounting parameter.</w:t>
       </w:r>
-    </w:p>
-    <w:p>
-      <w:pPr>
-        <w:spacing w:line="480" w:lineRule="auto"/>
-        <w:rPr>
-          <w:rFonts w:ascii="Times New Roman" w:hAnsi="Times New Roman"/>
-          <w:color w:val="0070C0"/>
-          <w:sz w:val="24"/>
-          <w:rPrChange w:id="117" w:author="Rossella" w:date="2026-07-30T18:28:00Z" w16du:dateUtc="2026-07-30T22:28:00Z">
-            <w:rPr>
-              <w:color w:val="0070C0"/>
-            </w:rPr>
-          </w:rPrChange>
-        </w:rPr>
-        <w:pPrChange w:id="118" w:author="Rossella" w:date="2026-07-30T18:28:00Z" w16du:dateUtc="2026-07-30T22:28:00Z">
-          <w:pPr/>
-        </w:pPrChange>
-      </w:pPr>
-      <w:ins w:id="119" w:author="Rossella" w:date="2026-07-30T18:28:00Z" w16du:dateUtc="2026-07-30T22:28:00Z">
-        <w:r>
-          <w:rPr>
-            <w:rFonts w:ascii="Times New Roman" w:eastAsia="Times New Roman" w:hAnsi="Times New Roman" w:cs="Times New Roman"/>
-            <w:color w:val="0070C0"/>
-            <w:sz w:val="24"/>
-            <w:szCs w:val="24"/>
-          </w:rPr>
-          <w:t xml:space="preserve"> </w:t>
-        </w:r>
-      </w:ins>
+      <w:r>
+        <w:rPr>
+          <w:rFonts w:ascii="Times New Roman" w:eastAsia="Times New Roman" w:hAnsi="Times New Roman" w:cs="Times New Roman"/>
+          <w:color w:val="0070C0"/>
+          <w:sz w:val="24"/>
+          <w:szCs w:val="24"/>
+        </w:rPr>
+        <w:t xml:space="preserve"> </w:t>
+      </w:r>
       <w:r>
         <w:rPr>
           <w:color w:val="0070C0"/>
@@ -2743,16 +1738,12 @@
         <w:rPr>
           <w:color w:val="0070C0"/>
         </w:rPr>
-        <w:pPrChange w:id="120" w:author="Rossella" w:date="2026-07-30T18:28:00Z" w16du:dateUtc="2026-07-30T22:28:00Z">
-          <w:pPr/>
-        </w:pPrChange>
       </w:pPr>
     </w:p>
     <w:p>
       <w:pPr>
         <w:spacing w:line="480" w:lineRule="auto"/>
         <w:rPr>
-          <w:del w:id="121" w:author="Rossella" w:date="2026-07-30T18:28:00Z" w16du:dateUtc="2026-07-30T22:28:00Z"/>
           <w:rFonts w:ascii="Times New Roman" w:eastAsia="Times New Roman" w:hAnsi="Times New Roman" w:cs="Times New Roman"/>
           <w:color w:val="0070C0"/>
           <w:sz w:val="24"/>
@@ -2765,51 +1756,15 @@
         </w:rPr>
         <w:t>“</w:t>
       </w:r>
-    </w:p>
-    <w:p>
-      <w:pPr>
-        <w:spacing w:line="480" w:lineRule="auto"/>
-        <w:rPr>
-          <w:rFonts w:ascii="Times New Roman" w:hAnsi="Times New Roman"/>
-          <w:color w:val="0070C0"/>
-          <w:sz w:val="24"/>
-          <w:rPrChange w:id="122" w:author="Rossella" w:date="2026-07-30T18:28:00Z" w16du:dateUtc="2026-07-30T22:28:00Z">
-            <w:rPr>
-              <w:rFonts w:ascii="Times New Roman" w:hAnsi="Times New Roman"/>
-              <w:color w:val="0070C0"/>
-              <w:sz w:val="24"/>
-              <w:u w:val="single"/>
-            </w:rPr>
-          </w:rPrChange>
-        </w:rPr>
-        <w:pPrChange w:id="123" w:author="Rossella" w:date="2026-07-30T18:28:00Z" w16du:dateUtc="2026-07-30T22:28:00Z">
-          <w:pPr>
-            <w:pBdr>
-              <w:top w:val="nil"/>
-              <w:left w:val="nil"/>
-              <w:bottom w:val="nil"/>
-              <w:right w:val="nil"/>
-              <w:between w:val="nil"/>
-            </w:pBdr>
-            <w:shd w:val="clear" w:color="auto" w:fill="FFFFFF"/>
-            <w:tabs>
-              <w:tab w:val="left" w:pos="270"/>
-            </w:tabs>
-            <w:spacing w:line="480" w:lineRule="auto"/>
-          </w:pPr>
-        </w:pPrChange>
-      </w:pPr>
-      <w:ins w:id="124" w:author="Rossella" w:date="2026-07-30T18:28:00Z" w16du:dateUtc="2026-07-30T22:28:00Z">
-        <w:r>
-          <w:rPr>
-            <w:rFonts w:ascii="Times New Roman" w:eastAsia="Times New Roman" w:hAnsi="Times New Roman" w:cs="Times New Roman"/>
-            <w:color w:val="0070C0"/>
-            <w:sz w:val="24"/>
-            <w:szCs w:val="24"/>
-          </w:rPr>
-          <w:t xml:space="preserve"> </w:t>
-        </w:r>
-      </w:ins>
+      <w:r>
+        <w:rPr>
+          <w:rFonts w:ascii="Times New Roman" w:eastAsia="Times New Roman" w:hAnsi="Times New Roman" w:cs="Times New Roman"/>
+          <w:color w:val="0070C0"/>
+          <w:sz w:val="24"/>
+          <w:szCs w:val="24"/>
+        </w:rPr>
+        <w:t xml:space="preserve"> </w:t>
+      </w:r>
       <w:r>
         <w:rPr>
           <w:rFonts w:ascii="Times New Roman" w:eastAsia="Times New Roman" w:hAnsi="Times New Roman" w:cs="Times New Roman"/>
@@ -2921,6 +1876,7 @@
               <w:sz w:val="24"/>
               <w:szCs w:val="24"/>
             </w:rPr>
+            <w:lastRenderedPageBreak/>
             <m:t>DV= h</m:t>
           </m:r>
           <m:d>
@@ -3182,161 +2138,138 @@
       <w:pPr>
         <w:spacing w:line="480" w:lineRule="auto"/>
         <w:rPr>
-          <w:del w:id="125" w:author="Rossella" w:date="2026-07-30T18:28:00Z" w16du:dateUtc="2026-07-30T22:28:00Z"/>
-          <w:rFonts w:ascii="Times New Roman" w:eastAsia="Times New Roman" w:hAnsi="Times New Roman" w:cs="Times New Roman"/>
-          <w:color w:val="0070C0"/>
-          <w:sz w:val="24"/>
-          <w:szCs w:val="24"/>
-        </w:rPr>
-      </w:pPr>
-      <m:oMathPara>
-        <m:oMath>
-          <m:r>
-            <w:rPr>
-              <w:rFonts w:ascii="Cambria Math" w:eastAsia="Cambria Math" w:hAnsi="Cambria Math" w:cs="Cambria Math"/>
-              <w:color w:val="0070C0"/>
-            </w:rPr>
-            <m:t>p</m:t>
-          </m:r>
-          <m:d>
-            <m:dPr>
-              <m:ctrlPr>
-                <w:rPr>
-                  <w:rFonts w:ascii="Cambria Math" w:eastAsia="Cambria Math" w:hAnsi="Cambria Math" w:cs="Cambria Math"/>
-                  <w:color w:val="0070C0"/>
-                </w:rPr>
-              </m:ctrlPr>
-            </m:dPr>
-            <m:e>
-              <m:r>
-                <w:rPr>
-                  <w:rFonts w:ascii="Cambria Math" w:eastAsia="Cambria Math" w:hAnsi="Cambria Math" w:cs="Cambria Math"/>
-                  <w:color w:val="0070C0"/>
-                </w:rPr>
-                <m:t>accept</m:t>
-              </m:r>
-            </m:e>
-          </m:d>
-          <m:r>
-            <w:rPr>
-              <w:rFonts w:ascii="Cambria Math" w:eastAsia="Cambria Math" w:hAnsi="Cambria Math" w:cs="Cambria Math"/>
-              <w:color w:val="0070C0"/>
-            </w:rPr>
-            <m:t>=</m:t>
-          </m:r>
-          <m:f>
-            <m:fPr>
-              <m:ctrlPr>
-                <w:rPr>
-                  <w:rFonts w:ascii="Cambria Math" w:eastAsia="Cambria Math" w:hAnsi="Cambria Math" w:cs="Cambria Math"/>
-                  <w:color w:val="0070C0"/>
-                </w:rPr>
-              </m:ctrlPr>
-            </m:fPr>
-            <m:num>
-              <m:r>
-                <w:rPr>
-                  <w:rFonts w:ascii="Cambria Math" w:eastAsia="Cambria Math" w:hAnsi="Cambria Math" w:cs="Cambria Math"/>
-                  <w:color w:val="0070C0"/>
-                </w:rPr>
-                <m:t>1</m:t>
-              </m:r>
-            </m:num>
-            <m:den>
-              <m:r>
-                <w:rPr>
-                  <w:rFonts w:ascii="Cambria Math" w:eastAsia="Cambria Math" w:hAnsi="Cambria Math" w:cs="Cambria Math"/>
-                  <w:color w:val="0070C0"/>
-                </w:rPr>
-                <m:t>1+</m:t>
-              </m:r>
-              <m:sSup>
-                <m:sSupPr>
-                  <m:ctrlPr>
-                    <w:rPr>
-                      <w:rFonts w:ascii="Cambria Math" w:eastAsia="Cambria Math" w:hAnsi="Cambria Math" w:cs="Cambria Math"/>
-                      <w:color w:val="0070C0"/>
-                    </w:rPr>
-                  </m:ctrlPr>
-                </m:sSupPr>
-                <m:e>
-                  <m:r>
-                    <w:rPr>
-                      <w:rFonts w:ascii="Cambria Math" w:eastAsia="Cambria Math" w:hAnsi="Cambria Math" w:cs="Cambria Math"/>
-                      <w:color w:val="0070C0"/>
-                    </w:rPr>
-                    <m:t>e</m:t>
-                  </m:r>
-                </m:e>
-                <m:sup>
-                  <m:r>
-                    <w:rPr>
-                      <w:rFonts w:ascii="Cambria Math" w:eastAsia="Cambria Math" w:hAnsi="Cambria Math" w:cs="Cambria Math"/>
-                      <w:color w:val="0070C0"/>
-                    </w:rPr>
-                    <m:t>-</m:t>
-                  </m:r>
-                  <m:f>
-                    <m:fPr>
-                      <m:ctrlPr>
-                        <w:rPr>
-                          <w:rFonts w:ascii="Cambria Math" w:eastAsia="Cambria Math" w:hAnsi="Cambria Math" w:cs="Cambria Math"/>
-                          <w:color w:val="0070C0"/>
-                        </w:rPr>
-                      </m:ctrlPr>
-                    </m:fPr>
-                    <m:num>
-                      <m:r>
-                        <w:rPr>
-                          <w:rFonts w:ascii="Cambria Math" w:eastAsia="Cambria Math" w:hAnsi="Cambria Math" w:cs="Cambria Math"/>
-                          <w:color w:val="0070C0"/>
-                        </w:rPr>
-                        <m:t>DV-θ</m:t>
-                      </m:r>
-                    </m:num>
-                    <m:den>
-                      <m:r>
-                        <w:rPr>
-                          <w:rFonts w:ascii="Cambria Math" w:eastAsia="Cambria Math" w:hAnsi="Cambria Math" w:cs="Cambria Math"/>
-                          <w:color w:val="0070C0"/>
-                        </w:rPr>
-                        <m:t>σ</m:t>
-                      </m:r>
-                    </m:den>
-                  </m:f>
-                </m:sup>
-              </m:sSup>
-            </m:den>
-          </m:f>
-        </m:oMath>
-      </m:oMathPara>
-    </w:p>
-    <w:p>
-      <w:pPr>
-        <w:spacing w:line="480" w:lineRule="auto"/>
-        <w:rPr>
-          <w:rFonts w:ascii="Times New Roman" w:hAnsi="Times New Roman"/>
-          <w:sz w:val="24"/>
-          <w:rPrChange w:id="126" w:author="Rossella" w:date="2026-07-30T18:28:00Z" w16du:dateUtc="2026-07-30T22:28:00Z">
-            <w:rPr>
-              <w:color w:val="0070C0"/>
-            </w:rPr>
-          </w:rPrChange>
-        </w:rPr>
-        <w:pPrChange w:id="127" w:author="Rossella" w:date="2026-07-30T18:28:00Z" w16du:dateUtc="2026-07-30T22:28:00Z">
-          <w:pPr/>
-        </w:pPrChange>
-      </w:pPr>
-      <w:ins w:id="128" w:author="Rossella" w:date="2026-07-30T18:28:00Z" w16du:dateUtc="2026-07-30T22:28:00Z">
-        <w:r>
+          <w:rFonts w:ascii="Times New Roman" w:eastAsia="Times New Roman" w:hAnsi="Times New Roman" w:cs="Times New Roman"/>
+          <w:sz w:val="24"/>
+          <w:szCs w:val="24"/>
+        </w:rPr>
+      </w:pPr>
+      <m:oMath>
+        <m:r>
           <w:rPr>
-            <w:rFonts w:ascii="Times New Roman" w:eastAsia="Times New Roman" w:hAnsi="Times New Roman" w:cs="Times New Roman"/>
-            <w:sz w:val="24"/>
-            <w:szCs w:val="24"/>
+            <w:rFonts w:ascii="Cambria Math" w:eastAsia="Cambria Math" w:hAnsi="Cambria Math" w:cs="Cambria Math"/>
+            <w:color w:val="0070C0"/>
           </w:rPr>
-          <w:t xml:space="preserve"> </w:t>
-        </w:r>
-      </w:ins>
+          <m:t>p</m:t>
+        </m:r>
+        <m:d>
+          <m:dPr>
+            <m:ctrlPr>
+              <w:rPr>
+                <w:rFonts w:ascii="Cambria Math" w:eastAsia="Cambria Math" w:hAnsi="Cambria Math" w:cs="Cambria Math"/>
+                <w:color w:val="0070C0"/>
+              </w:rPr>
+            </m:ctrlPr>
+          </m:dPr>
+          <m:e>
+            <m:r>
+              <w:rPr>
+                <w:rFonts w:ascii="Cambria Math" w:eastAsia="Cambria Math" w:hAnsi="Cambria Math" w:cs="Cambria Math"/>
+                <w:color w:val="0070C0"/>
+              </w:rPr>
+              <m:t>accept</m:t>
+            </m:r>
+          </m:e>
+        </m:d>
+        <m:r>
+          <w:rPr>
+            <w:rFonts w:ascii="Cambria Math" w:eastAsia="Cambria Math" w:hAnsi="Cambria Math" w:cs="Cambria Math"/>
+            <w:color w:val="0070C0"/>
+          </w:rPr>
+          <m:t>=</m:t>
+        </m:r>
+        <m:f>
+          <m:fPr>
+            <m:ctrlPr>
+              <w:rPr>
+                <w:rFonts w:ascii="Cambria Math" w:eastAsia="Cambria Math" w:hAnsi="Cambria Math" w:cs="Cambria Math"/>
+                <w:color w:val="0070C0"/>
+              </w:rPr>
+            </m:ctrlPr>
+          </m:fPr>
+          <m:num>
+            <m:r>
+              <w:rPr>
+                <w:rFonts w:ascii="Cambria Math" w:eastAsia="Cambria Math" w:hAnsi="Cambria Math" w:cs="Cambria Math"/>
+                <w:color w:val="0070C0"/>
+              </w:rPr>
+              <m:t>1</m:t>
+            </m:r>
+          </m:num>
+          <m:den>
+            <m:r>
+              <w:rPr>
+                <w:rFonts w:ascii="Cambria Math" w:eastAsia="Cambria Math" w:hAnsi="Cambria Math" w:cs="Cambria Math"/>
+                <w:color w:val="0070C0"/>
+              </w:rPr>
+              <m:t>1+</m:t>
+            </m:r>
+            <m:sSup>
+              <m:sSupPr>
+                <m:ctrlPr>
+                  <w:rPr>
+                    <w:rFonts w:ascii="Cambria Math" w:eastAsia="Cambria Math" w:hAnsi="Cambria Math" w:cs="Cambria Math"/>
+                    <w:color w:val="0070C0"/>
+                  </w:rPr>
+                </m:ctrlPr>
+              </m:sSupPr>
+              <m:e>
+                <m:r>
+                  <w:rPr>
+                    <w:rFonts w:ascii="Cambria Math" w:eastAsia="Cambria Math" w:hAnsi="Cambria Math" w:cs="Cambria Math"/>
+                    <w:color w:val="0070C0"/>
+                  </w:rPr>
+                  <m:t>e</m:t>
+                </m:r>
+              </m:e>
+              <m:sup>
+                <m:r>
+                  <w:rPr>
+                    <w:rFonts w:ascii="Cambria Math" w:eastAsia="Cambria Math" w:hAnsi="Cambria Math" w:cs="Cambria Math"/>
+                    <w:color w:val="0070C0"/>
+                  </w:rPr>
+                  <m:t>-</m:t>
+                </m:r>
+                <m:f>
+                  <m:fPr>
+                    <m:ctrlPr>
+                      <w:rPr>
+                        <w:rFonts w:ascii="Cambria Math" w:eastAsia="Cambria Math" w:hAnsi="Cambria Math" w:cs="Cambria Math"/>
+                        <w:color w:val="0070C0"/>
+                      </w:rPr>
+                    </m:ctrlPr>
+                  </m:fPr>
+                  <m:num>
+                    <m:r>
+                      <w:rPr>
+                        <w:rFonts w:ascii="Cambria Math" w:eastAsia="Cambria Math" w:hAnsi="Cambria Math" w:cs="Cambria Math"/>
+                        <w:color w:val="0070C0"/>
+                      </w:rPr>
+                      <m:t>DV-θ</m:t>
+                    </m:r>
+                  </m:num>
+                  <m:den>
+                    <m:r>
+                      <w:rPr>
+                        <w:rFonts w:ascii="Cambria Math" w:eastAsia="Cambria Math" w:hAnsi="Cambria Math" w:cs="Cambria Math"/>
+                        <w:color w:val="0070C0"/>
+                      </w:rPr>
+                      <m:t>σ</m:t>
+                    </m:r>
+                  </m:den>
+                </m:f>
+              </m:sup>
+            </m:sSup>
+          </m:den>
+        </m:f>
+      </m:oMath>
+      <w:r>
+        <w:rPr>
+          <w:rFonts w:ascii="Times New Roman" w:eastAsia="Times New Roman" w:hAnsi="Times New Roman" w:cs="Times New Roman"/>
+          <w:sz w:val="24"/>
+          <w:szCs w:val="24"/>
+        </w:rPr>
+        <w:t xml:space="preserve"> </w:t>
+      </w:r>
       <w:r>
         <w:rPr>
           <w:color w:val="0070C0"/>
@@ -3447,7 +2380,6 @@
         </w:tabs>
         <w:spacing w:line="480" w:lineRule="auto"/>
         <w:rPr>
-          <w:del w:id="129" w:author="Rossella" w:date="2026-07-30T18:28:00Z" w16du:dateUtc="2026-07-30T22:28:00Z"/>
           <w:rFonts w:ascii="Times New Roman" w:eastAsia="Times New Roman" w:hAnsi="Times New Roman" w:cs="Times New Roman"/>
           <w:b/>
           <w:bCs/>
@@ -3462,49 +2394,17 @@
         </w:rPr>
         <w:t>“</w:t>
       </w:r>
-    </w:p>
-    <w:p>
-      <w:pPr>
-        <w:pBdr>
-          <w:top w:val="nil"/>
-          <w:left w:val="nil"/>
-          <w:bottom w:val="nil"/>
-          <w:right w:val="nil"/>
-          <w:between w:val="nil"/>
-        </w:pBdr>
-        <w:shd w:val="clear" w:color="auto" w:fill="FFFFFF"/>
-        <w:tabs>
-          <w:tab w:val="left" w:pos="270"/>
-        </w:tabs>
-        <w:spacing w:line="480" w:lineRule="auto"/>
-        <w:rPr>
-          <w:rFonts w:ascii="Times New Roman" w:hAnsi="Times New Roman"/>
+      <w:r>
+        <w:rPr>
+          <w:rFonts w:ascii="Times New Roman" w:eastAsia="Times New Roman" w:hAnsi="Times New Roman" w:cs="Times New Roman"/>
           <w:b/>
-          <w:color w:val="0070C0"/>
-          <w:sz w:val="24"/>
-          <w:rPrChange w:id="130" w:author="Rossella" w:date="2026-07-30T18:28:00Z" w16du:dateUtc="2026-07-30T22:28:00Z">
-            <w:rPr>
-              <w:rFonts w:ascii="Times New Roman" w:hAnsi="Times New Roman"/>
-              <w:color w:val="0070C0"/>
-              <w:sz w:val="24"/>
-              <w:u w:val="single"/>
-            </w:rPr>
-          </w:rPrChange>
-        </w:rPr>
-      </w:pPr>
-      <w:ins w:id="131" w:author="Rossella" w:date="2026-07-30T18:28:00Z" w16du:dateUtc="2026-07-30T22:28:00Z">
-        <w:r>
-          <w:rPr>
-            <w:rFonts w:ascii="Times New Roman" w:eastAsia="Times New Roman" w:hAnsi="Times New Roman" w:cs="Times New Roman"/>
-            <w:b/>
-            <w:bCs/>
-            <w:color w:val="0070C0"/>
-            <w:sz w:val="24"/>
-            <w:szCs w:val="24"/>
-          </w:rPr>
-          <w:t xml:space="preserve"> </w:t>
-        </w:r>
-      </w:ins>
+          <w:bCs/>
+          <w:color w:val="0070C0"/>
+          <w:sz w:val="24"/>
+          <w:szCs w:val="24"/>
+        </w:rPr>
+        <w:t xml:space="preserve"> </w:t>
+      </w:r>
       <w:r>
         <w:rPr>
           <w:rFonts w:ascii="Times New Roman" w:eastAsia="Times New Roman" w:hAnsi="Times New Roman" w:cs="Times New Roman"/>
@@ -4205,6 +3105,7 @@
         <w:rPr>
           <w:color w:val="0070C0"/>
         </w:rPr>
+        <w:lastRenderedPageBreak/>
         <w:t xml:space="preserve">The reviewer understood our model </w:t>
       </w:r>
       <w:r>
@@ -4722,7 +3623,6 @@
     <w:p>
       <w:pPr>
         <w:rPr>
-          <w:del w:id="132" w:author="Rossella" w:date="2026-07-30T18:28:00Z" w16du:dateUtc="2026-07-30T22:28:00Z"/>
           <w:rFonts w:ascii="Cambria Math" w:eastAsia="Cambria Math" w:hAnsi="Cambria Math" w:cs="Cambria Math"/>
         </w:rPr>
       </w:pPr>
@@ -4732,45 +3632,12 @@
         </w:rPr>
         <w:t>“</w:t>
       </w:r>
-    </w:p>
-    <w:p>
-      <w:pPr>
-        <w:rPr>
-          <w:rFonts w:ascii="Cambria Math" w:hAnsi="Cambria Math"/>
-          <w:rPrChange w:id="133" w:author="Rossella" w:date="2026-07-30T18:28:00Z" w16du:dateUtc="2026-07-30T22:28:00Z">
-            <w:rPr>
-              <w:rFonts w:ascii="Times New Roman" w:hAnsi="Times New Roman"/>
-              <w:color w:val="0070C0"/>
-              <w:sz w:val="24"/>
-              <w:u w:val="single"/>
-            </w:rPr>
-          </w:rPrChange>
-        </w:rPr>
-        <w:pPrChange w:id="134" w:author="Rossella" w:date="2026-07-30T18:28:00Z" w16du:dateUtc="2026-07-30T22:28:00Z">
-          <w:pPr>
-            <w:pBdr>
-              <w:top w:val="nil"/>
-              <w:left w:val="nil"/>
-              <w:bottom w:val="nil"/>
-              <w:right w:val="nil"/>
-              <w:between w:val="nil"/>
-            </w:pBdr>
-            <w:shd w:val="clear" w:color="auto" w:fill="FFFFFF"/>
-            <w:tabs>
-              <w:tab w:val="left" w:pos="270"/>
-            </w:tabs>
-            <w:spacing w:line="480" w:lineRule="auto"/>
-          </w:pPr>
-        </w:pPrChange>
-      </w:pPr>
-      <w:ins w:id="135" w:author="Rossella" w:date="2026-07-30T18:28:00Z" w16du:dateUtc="2026-07-30T22:28:00Z">
-        <w:r>
-          <w:rPr>
-            <w:rFonts w:ascii="Cambria Math" w:eastAsia="Cambria Math" w:hAnsi="Cambria Math" w:cs="Cambria Math"/>
-          </w:rPr>
-          <w:t xml:space="preserve"> </w:t>
-        </w:r>
-      </w:ins>
+      <w:r>
+        <w:rPr>
+          <w:rFonts w:ascii="Cambria Math" w:eastAsia="Cambria Math" w:hAnsi="Cambria Math" w:cs="Cambria Math"/>
+        </w:rPr>
+        <w:t xml:space="preserve"> </w:t>
+      </w:r>
       <w:r>
         <w:rPr>
           <w:rFonts w:ascii="Times New Roman" w:eastAsia="Times New Roman" w:hAnsi="Times New Roman" w:cs="Times New Roman"/>
@@ -4842,7 +3709,17 @@
           <w:sz w:val="24"/>
           <w:szCs w:val="24"/>
         </w:rPr>
-        <w:t xml:space="preserve">On the other hand, if the go signal is yellow, animals can reject right away. However, if the go signal is purple, they must wait for an addition delay, for the go signal to turn yellow, in order to reject the offer. This effectively decreases the value for rejecting the offer following the purple go signal. </w:t>
+        <w:t xml:space="preserve">On the other hand, if the go signal is yellow, animals can reject right away. However, if the go signal is purple, they must wait for an addition delay, for the go signal to turn yellow, in order to </w:t>
+      </w:r>
+      <w:r>
+        <w:rPr>
+          <w:rFonts w:ascii="Times New Roman" w:eastAsia="Times New Roman" w:hAnsi="Times New Roman" w:cs="Times New Roman"/>
+          <w:color w:val="0070C0"/>
+          <w:sz w:val="24"/>
+          <w:szCs w:val="24"/>
+        </w:rPr>
+        <w:lastRenderedPageBreak/>
+        <w:t xml:space="preserve">reject the offer. This effectively decreases the value for rejecting the offer following the purple go signal. </w:t>
       </w:r>
     </w:p>
     <w:p>
@@ -6132,6 +5009,7 @@
           <w:sz w:val="24"/>
           <w:szCs w:val="24"/>
         </w:rPr>
+        <w:lastRenderedPageBreak/>
         <w:t xml:space="preserve">For Model 2v, </w:t>
       </w:r>
     </w:p>
@@ -6871,6 +5749,7 @@
           <w:noProof/>
           <w:color w:val="0070C0"/>
         </w:rPr>
+        <w:lastRenderedPageBreak/>
         <w:drawing>
           <wp:inline distT="0" distB="0" distL="0" distR="0" wp14:anchorId="286408CF" wp14:editId="20B2BFC6">
             <wp:extent cx="4064587" cy="4220115"/>
@@ -7130,7 +6009,17 @@
           <w:sz w:val="24"/>
           <w:szCs w:val="24"/>
         </w:rPr>
-        <w:t xml:space="preserve"> This agrees with our interpretation that Monkey S uses delays to adjust temporal discounting calculations (their decision thresholds are delay sensitive), whereas Monkey T treats different go signals just as additional cues and their decision threshold is not adjusted based on delays.  </w:t>
+        <w:t xml:space="preserve"> This agrees with our interpretation that Monkey S uses delays to adjust temporal discounting calculations (their </w:t>
+      </w:r>
+      <w:r>
+        <w:rPr>
+          <w:rFonts w:ascii="Times New Roman" w:eastAsia="Times New Roman" w:hAnsi="Times New Roman" w:cs="Times New Roman"/>
+          <w:color w:val="0070C0"/>
+          <w:sz w:val="24"/>
+          <w:szCs w:val="24"/>
+        </w:rPr>
+        <w:lastRenderedPageBreak/>
+        <w:t xml:space="preserve">decision thresholds are delay sensitive), whereas Monkey T treats different go signals just as additional cues and their decision threshold is not adjusted based on delays.  </w:t>
       </w:r>
     </w:p>
     <w:p>
@@ -7279,6 +6168,7 @@
           <w:color w:val="0070C0"/>
           <w:lang w:val="en-US"/>
         </w:rPr>
+        <w:lastRenderedPageBreak/>
         <w:t xml:space="preserve">Briefly, </w:t>
       </w:r>
       <w:r>
@@ -7354,7 +6244,6 @@
     <w:p>
       <w:pPr>
         <w:rPr>
-          <w:del w:id="136" w:author="Rossella" w:date="2026-07-30T18:28:00Z" w16du:dateUtc="2026-07-30T22:28:00Z"/>
           <w:color w:val="0070C0"/>
         </w:rPr>
       </w:pPr>
@@ -7364,46 +6253,12 @@
         </w:rPr>
         <w:t>“</w:t>
       </w:r>
-    </w:p>
-    <w:p>
-      <w:pPr>
-        <w:spacing w:line="480" w:lineRule="auto"/>
-        <w:rPr>
-          <w:del w:id="137" w:author="Rossella" w:date="2026-07-30T18:28:00Z" w16du:dateUtc="2026-07-30T22:28:00Z"/>
-          <w:rFonts w:ascii="Times New Roman" w:eastAsia="Times New Roman" w:hAnsi="Times New Roman" w:cs="Times New Roman"/>
-          <w:color w:val="0070C0"/>
-          <w:sz w:val="24"/>
-          <w:szCs w:val="24"/>
-        </w:rPr>
-      </w:pPr>
-    </w:p>
-    <w:p>
-      <w:pPr>
-        <w:rPr>
-          <w:color w:val="0070C0"/>
-          <w:rPrChange w:id="138" w:author="Rossella" w:date="2026-07-30T18:28:00Z" w16du:dateUtc="2026-07-30T22:28:00Z">
-            <w:rPr>
-              <w:rFonts w:ascii="Times New Roman" w:hAnsi="Times New Roman"/>
-              <w:i/>
-              <w:color w:val="0070C0"/>
-              <w:sz w:val="24"/>
-            </w:rPr>
-          </w:rPrChange>
-        </w:rPr>
-        <w:pPrChange w:id="139" w:author="Rossella" w:date="2026-07-30T18:28:00Z" w16du:dateUtc="2026-07-30T22:28:00Z">
-          <w:pPr>
-            <w:spacing w:line="480" w:lineRule="auto"/>
-          </w:pPr>
-        </w:pPrChange>
-      </w:pPr>
-      <w:ins w:id="140" w:author="Rossella" w:date="2026-07-30T18:28:00Z" w16du:dateUtc="2026-07-30T22:28:00Z">
-        <w:r>
-          <w:rPr>
-            <w:color w:val="0070C0"/>
-          </w:rPr>
-          <w:t xml:space="preserve"> </w:t>
-        </w:r>
-      </w:ins>
+      <w:r>
+        <w:rPr>
+          <w:color w:val="0070C0"/>
+        </w:rPr>
+        <w:t xml:space="preserve"> </w:t>
+      </w:r>
       <w:r>
         <w:rPr>
           <w:rFonts w:ascii="Times New Roman" w:eastAsia="Times New Roman" w:hAnsi="Times New Roman" w:cs="Times New Roman"/>
@@ -10110,7 +8965,6 @@
       <w:pPr>
         <w:spacing w:after="160"/>
         <w:rPr>
-          <w:del w:id="141" w:author="Rossella" w:date="2026-07-30T18:28:00Z" w16du:dateUtc="2026-07-30T22:28:00Z"/>
           <w:rFonts w:ascii="Times New Roman" w:eastAsia="Times New Roman" w:hAnsi="Times New Roman" w:cs="Times New Roman"/>
           <w:color w:val="0070C0"/>
           <w:sz w:val="24"/>
@@ -10126,22 +8980,6 @@
         </w:rPr>
         <w:t xml:space="preserve">Population coding dimensions for drop and delay were computed for [-250 0], [0 250], [250 500], [500 750], [750 1000] ms time windows, relative to the offer onset. We also computed it for [-250 0] ms before the go signal. Population coding dimension for value was computed at [-250 0] ms before the go signal. </w:t>
       </w:r>
-    </w:p>
-    <w:p>
-      <w:pPr>
-        <w:spacing w:after="160"/>
-        <w:rPr>
-          <w:rFonts w:ascii="Times New Roman" w:hAnsi="Times New Roman"/>
-          <w:color w:val="0070C0"/>
-          <w:sz w:val="24"/>
-          <w:rPrChange w:id="142" w:author="Rossella" w:date="2026-07-30T18:28:00Z" w16du:dateUtc="2026-07-30T22:28:00Z">
-            <w:rPr/>
-          </w:rPrChange>
-        </w:rPr>
-        <w:pPrChange w:id="143" w:author="Rossella" w:date="2026-07-30T18:28:00Z" w16du:dateUtc="2026-07-30T22:28:00Z">
-          <w:pPr/>
-        </w:pPrChange>
-      </w:pPr>
       <w:r>
         <w:rPr>
           <w:color w:val="0070C0"/>
@@ -10238,7 +9076,14 @@
         <w:rPr>
           <w:color w:val="0070C0"/>
         </w:rPr>
-        <w:t>We performed a separate regression analysis, and extracted the coding dimension for the go signal (yellow versus purple). T</w:t>
+        <w:t xml:space="preserve">We performed a separate regression analysis, and extracted the coding dimension for the go signal (yellow </w:t>
+      </w:r>
+      <w:r>
+        <w:rPr>
+          <w:color w:val="0070C0"/>
+        </w:rPr>
+        <w:lastRenderedPageBreak/>
+        <w:t>versus purple). T</w:t>
       </w:r>
       <w:r>
         <w:rPr>
@@ -10463,34 +9308,6 @@
       </w:pPr>
     </w:p>
     <w:p>
-      <w:pPr>
-        <w:rPr>
-          <w:del w:id="144" w:author="Rossella" w:date="2026-07-30T18:28:00Z" w16du:dateUtc="2026-07-30T22:28:00Z"/>
-          <w:color w:val="0070C0"/>
-        </w:rPr>
-      </w:pPr>
-    </w:p>
-    <w:p>
-      <w:pPr>
-        <w:rPr>
-          <w:del w:id="145" w:author="Rossella" w:date="2026-07-30T18:28:00Z" w16du:dateUtc="2026-07-30T22:28:00Z"/>
-          <w:color w:val="0070C0"/>
-        </w:rPr>
-      </w:pPr>
-    </w:p>
-    <w:p>
-      <w:pPr>
-        <w:rPr>
-          <w:del w:id="146" w:author="Rossella" w:date="2026-07-30T18:28:00Z" w16du:dateUtc="2026-07-30T22:28:00Z"/>
-        </w:rPr>
-      </w:pPr>
-    </w:p>
-    <w:p>
-      <w:del w:id="147" w:author="Rossella" w:date="2026-07-30T18:28:00Z" w16du:dateUtc="2026-07-30T22:28:00Z">
-        <w:r>
-          <w:br/>
-        </w:r>
-      </w:del>
       <w:r>
         <w:br/>
         <w:t>4. Relating individual differences in neural modulation to behavioral strategy</w:t>
@@ -10502,9 +9319,7 @@
       <w:r>
         <w:rPr>
           <w:b/>
-          <w:rPrChange w:id="148" w:author="Rossella" w:date="2026-07-30T18:28:00Z" w16du:dateUtc="2026-07-30T22:28:00Z">
-            <w:rPr/>
-          </w:rPrChange>
+          <w:bCs/>
         </w:rPr>
         <w:t>It would be helpful if the authors could further discuss how these individual differences in neural activity might relate to the observed differences in decision strategy.</w:t>
       </w:r>
@@ -10677,7 +9492,7 @@
 
 <file path=word/comments.xml><?xml version="1.0" encoding="utf-8"?>
 <w:comments xmlns:wpc="http://schemas.microsoft.com/office/word/2010/wordprocessingCanvas" xmlns:cx="http://schemas.microsoft.com/office/drawing/2014/chartex" xmlns:cx1="http://schemas.microsoft.com/office/drawing/2015/9/8/chartex" xmlns:cx2="http://schemas.microsoft.com/office/drawing/2015/10/21/chartex" xmlns:cx3="http://schemas.microsoft.com/office/drawing/2016/5/9/chartex" xmlns:cx4="http://schemas.microsoft.com/office/drawing/2016/5/10/chartex" xmlns:cx5="http://schemas.microsoft.com/office/drawing/2016/5/11/chartex" xmlns:cx6="http://schemas.microsoft.com/office/drawing/2016/5/12/chartex" xmlns:cx7="http://schemas.microsoft.com/office/drawing/2016/5/13/chartex" xmlns:cx8="http://schemas.microsoft.com/office/drawing/2016/5/14/chartex" xmlns:mc="http://schemas.openxmlformats.org/markup-compatibility/2006" xmlns:aink="http://schemas.microsoft.com/office/drawing/2016/ink" xmlns:am3d="http://schemas.microsoft.com/office/drawing/2017/model3d" xmlns:o="urn:schemas-microsoft-com:office:office" xmlns:oel="http://schemas.microsoft.com/office/2019/extlst" xmlns:r="http://schemas.openxmlformats.org/officeDocument/2006/relationships" xmlns:m="http://schemas.openxmlformats.org/officeDocument/2006/math" xmlns:v="urn:schemas-microsoft-com:vml" xmlns:wp14="http://schemas.microsoft.com/office/word/2010/wordprocessingDrawing" xmlns:wp="http://schemas.openxmlformats.org/drawingml/2006/wordprocessingDrawing" xmlns:w10="urn:schemas-microsoft-com:office:word" xmlns:w="http://schemas.openxmlformats.org/wordprocessingml/2006/main" xmlns:w14="http://schemas.microsoft.com/office/word/2010/wordml" xmlns:w15="http://schemas.microsoft.com/office/word/2012/wordml" xmlns:w16cei="http://schemas.microsoft.com/office/word/2026/wordml/cei" xmlns:w16cex="http://schemas.microsoft.com/office/word/2018/wordml/cex" xmlns:w16cid="http://schemas.microsoft.com/office/word/2016/wordml/cid" xmlns:w16="http://schemas.microsoft.com/office/word/2018/wordml" xmlns:w16du="http://schemas.microsoft.com/office/word/2023/wordml/word16du" xmlns:w16sdtdh="http://schemas.microsoft.com/office/word/2020/wordml/sdtdatahash" xmlns:w16sdtfl="http://schemas.microsoft.com/office/word/2024/wordml/sdtformatlock" xmlns:w16se="http://schemas.microsoft.com/office/word/2015/wordml/symex" xmlns:wpg="http://schemas.microsoft.com/office/word/2010/wordprocessingGroup" xmlns:wpi="http://schemas.microsoft.com/office/word/2010/wordprocessingInk" xmlns:wne="http://schemas.microsoft.com/office/word/2006/wordml" xmlns:wps="http://schemas.microsoft.com/office/word/2010/wordprocessingShape" mc:Ignorable="w14 w15 w16se w16cid w16 w16cex w16sdtdh w16sdtfl w16du wp14">
-  <w:comment w:id="22" w:author="Rossella Falcone" w:date="2026-07-30T10:32:00Z" w:initials="RF">
+  <w:comment w:id="0" w:author="Rossella Falcone" w:date="2026-07-30T10:32:00Z" w:initials="RF">
     <w:p>
       <w:pPr>
         <w:pStyle w:val="CommentText"/>
@@ -10812,52 +9627,6 @@
           <w:lang w:val="en-US"/>
         </w:rPr>
         <w:t xml:space="preserve"> </w:t>
-      </w:r>
-    </w:p>
-  </w:comment>
-  <w:comment w:id="92" w:author="ROSSELLA FALCONE" w:date="2026-07-15T17:13:00Z" w:initials="">
-    <w:p>
-      <w:pPr>
-        <w:widowControl w:val="0"/>
-        <w:pBdr>
-          <w:top w:val="nil"/>
-          <w:left w:val="nil"/>
-          <w:bottom w:val="nil"/>
-          <w:right w:val="nil"/>
-          <w:between w:val="nil"/>
-        </w:pBdr>
-        <w:spacing w:line="240" w:lineRule="auto"/>
-        <w:rPr>
-          <w:color w:val="000000"/>
-        </w:rPr>
-      </w:pPr>
-      <w:r>
-        <w:rPr>
-          <w:rStyle w:val="CommentReference"/>
-        </w:rPr>
-        <w:annotationRef/>
-      </w:r>
-      <w:r>
-        <w:rPr>
-          <w:color w:val="000000"/>
-        </w:rPr>
-        <w:t>Please Siyu double check!</w:t>
-      </w:r>
-    </w:p>
-  </w:comment>
-  <w:comment w:id="93" w:author="Siyu Wang" w:date="2026-07-24T11:15:00Z" w:initials="SW">
-    <w:p>
-      <w:pPr>
-        <w:pStyle w:val="CommentText"/>
-      </w:pPr>
-      <w:r>
-        <w:rPr>
-          <w:rStyle w:val="CommentReference"/>
-        </w:rPr>
-        <w:annotationRef/>
-      </w:r>
-      <w:r>
-        <w:t>Rewritten!</w:t>
       </w:r>
     </w:p>
   </w:comment>
@@ -10867,23 +9636,18 @@
 <file path=word/commentsExtended.xml><?xml version="1.0" encoding="utf-8"?>
 <w15:commentsEx xmlns:wpc="http://schemas.microsoft.com/office/word/2010/wordprocessingCanvas" xmlns:cx="http://schemas.microsoft.com/office/drawing/2014/chartex" xmlns:cx1="http://schemas.microsoft.com/office/drawing/2015/9/8/chartex" xmlns:cx2="http://schemas.microsoft.com/office/drawing/2015/10/21/chartex" xmlns:cx3="http://schemas.microsoft.com/office/drawing/2016/5/9/chartex" xmlns:cx4="http://schemas.microsoft.com/office/drawing/2016/5/10/chartex" xmlns:cx5="http://schemas.microsoft.com/office/drawing/2016/5/11/chartex" xmlns:cx6="http://schemas.microsoft.com/office/drawing/2016/5/12/chartex" xmlns:cx7="http://schemas.microsoft.com/office/drawing/2016/5/13/chartex" xmlns:cx8="http://schemas.microsoft.com/office/drawing/2016/5/14/chartex" xmlns:mc="http://schemas.openxmlformats.org/markup-compatibility/2006" xmlns:aink="http://schemas.microsoft.com/office/drawing/2016/ink" xmlns:am3d="http://schemas.microsoft.com/office/drawing/2017/model3d" xmlns:o="urn:schemas-microsoft-com:office:office" xmlns:oel="http://schemas.microsoft.com/office/2019/extlst" xmlns:r="http://schemas.openxmlformats.org/officeDocument/2006/relationships" xmlns:m="http://schemas.openxmlformats.org/officeDocument/2006/math" xmlns:v="urn:schemas-microsoft-com:vml" xmlns:wp14="http://schemas.microsoft.com/office/word/2010/wordprocessingDrawing" xmlns:wp="http://schemas.openxmlformats.org/drawingml/2006/wordprocessingDrawing" xmlns:w10="urn:schemas-microsoft-com:office:word" xmlns:w="http://schemas.openxmlformats.org/wordprocessingml/2006/main" xmlns:w14="http://schemas.microsoft.com/office/word/2010/wordml" xmlns:w15="http://schemas.microsoft.com/office/word/2012/wordml" xmlns:w16cei="http://schemas.microsoft.com/office/word/2026/wordml/cei" xmlns:w16cex="http://schemas.microsoft.com/office/word/2018/wordml/cex" xmlns:w16cid="http://schemas.microsoft.com/office/word/2016/wordml/cid" xmlns:w16="http://schemas.microsoft.com/office/word/2018/wordml" xmlns:w16du="http://schemas.microsoft.com/office/word/2023/wordml/word16du" xmlns:w16sdtdh="http://schemas.microsoft.com/office/word/2020/wordml/sdtdatahash" xmlns:w16sdtfl="http://schemas.microsoft.com/office/word/2024/wordml/sdtformatlock" xmlns:w16se="http://schemas.microsoft.com/office/word/2015/wordml/symex" xmlns:wpg="http://schemas.microsoft.com/office/word/2010/wordprocessingGroup" xmlns:wpi="http://schemas.microsoft.com/office/word/2010/wordprocessingInk" xmlns:wne="http://schemas.microsoft.com/office/word/2006/wordml" xmlns:wps="http://schemas.microsoft.com/office/word/2010/wordprocessingShape" mc:Ignorable="w14 w15 w16se w16cid w16 w16cex w16sdtdh w16sdtfl w16du wp14">
   <w15:commentEx w15:paraId="2769EEDB" w15:done="0"/>
-  <w15:commentEx w15:paraId="00000047" w15:done="0"/>
-  <w15:commentEx w15:paraId="4889BF48" w15:paraIdParent="00000047" w15:done="0"/>
 </w15:commentsEx>
 </file>
 
 <file path=word/commentsExtensible.xml><?xml version="1.0" encoding="utf-8"?>
 <w16cex:commentsExtensible xmlns:wpc="http://schemas.microsoft.com/office/word/2010/wordprocessingCanvas" xmlns:cx="http://schemas.microsoft.com/office/drawing/2014/chartex" xmlns:cx1="http://schemas.microsoft.com/office/drawing/2015/9/8/chartex" xmlns:cx2="http://schemas.microsoft.com/office/drawing/2015/10/21/chartex" xmlns:cx3="http://schemas.microsoft.com/office/drawing/2016/5/9/chartex" xmlns:cx4="http://schemas.microsoft.com/office/drawing/2016/5/10/chartex" xmlns:cx5="http://schemas.microsoft.com/office/drawing/2016/5/11/chartex" xmlns:cx6="http://schemas.microsoft.com/office/drawing/2016/5/12/chartex" xmlns:cx7="http://schemas.microsoft.com/office/drawing/2016/5/13/chartex" xmlns:cx8="http://schemas.microsoft.com/office/drawing/2016/5/14/chartex" xmlns:cr="http://schemas.microsoft.com/office/comments/2020/reactions" xmlns:mc="http://schemas.openxmlformats.org/markup-compatibility/2006" xmlns:aink="http://schemas.microsoft.com/office/drawing/2016/ink" xmlns:am3d="http://schemas.microsoft.com/office/drawing/2017/model3d" xmlns:o="urn:schemas-microsoft-com:office:office" xmlns:oel="http://schemas.microsoft.com/office/2019/extlst" xmlns:r="http://schemas.openxmlformats.org/officeDocument/2006/relationships" xmlns:m="http://schemas.openxmlformats.org/officeDocument/2006/math" xmlns:v="urn:schemas-microsoft-com:vml" xmlns:wp14="http://schemas.microsoft.com/office/word/2010/wordprocessingDrawing" xmlns:wp="http://schemas.openxmlformats.org/drawingml/2006/wordprocessingDrawing" xmlns:w10="urn:schemas-microsoft-com:office:word" xmlns:w="http://schemas.openxmlformats.org/wordprocessingml/2006/main" xmlns:w14="http://schemas.microsoft.com/office/word/2010/wordml" xmlns:w15="http://schemas.microsoft.com/office/word/2012/wordml" xmlns:w16cei="http://schemas.microsoft.com/office/word/2026/wordml/cei" xmlns:w16cex="http://schemas.microsoft.com/office/word/2018/wordml/cex" xmlns:w16cid="http://schemas.microsoft.com/office/word/2016/wordml/cid" xmlns:w16="http://schemas.microsoft.com/office/word/2018/wordml" xmlns:w16du="http://schemas.microsoft.com/office/word/2023/wordml/word16du" xmlns:w16sdtdh="http://schemas.microsoft.com/office/word/2020/wordml/sdtdatahash" xmlns:w16sdtfl="http://schemas.microsoft.com/office/word/2024/wordml/sdtformatlock" xmlns:w16se="http://schemas.microsoft.com/office/word/2015/wordml/symex" xmlns:wpg="http://schemas.microsoft.com/office/word/2010/wordprocessingGroup" xmlns:wpi="http://schemas.microsoft.com/office/word/2010/wordprocessingInk" xmlns:wne="http://schemas.microsoft.com/office/word/2006/wordml" xmlns:wps="http://schemas.microsoft.com/office/word/2010/wordprocessingShape" mc:Ignorable="w14 w15 w16se w16cid w16 w16cex w16sdtdh w16sdtfl cr w16du wp14">
   <w16cex:commentExtensible w16cex:durableId="15C9830F" w16cex:dateUtc="2026-07-30T14:32:00Z"/>
-  <w16cex:commentExtensible w16cex:durableId="7428BFB7" w16cex:dateUtc="2026-07-24T15:15:00Z"/>
 </w16cex:commentsExtensible>
 </file>
 
 <file path=word/commentsIds.xml><?xml version="1.0" encoding="utf-8"?>
 <w16cid:commentsIds xmlns:wpc="http://schemas.microsoft.com/office/word/2010/wordprocessingCanvas" xmlns:cx="http://schemas.microsoft.com/office/drawing/2014/chartex" xmlns:cx1="http://schemas.microsoft.com/office/drawing/2015/9/8/chartex" xmlns:cx2="http://schemas.microsoft.com/office/drawing/2015/10/21/chartex" xmlns:cx3="http://schemas.microsoft.com/office/drawing/2016/5/9/chartex" xmlns:cx4="http://schemas.microsoft.com/office/drawing/2016/5/10/chartex" xmlns:cx5="http://schemas.microsoft.com/office/drawing/2016/5/11/chartex" xmlns:cx6="http://schemas.microsoft.com/office/drawing/2016/5/12/chartex" xmlns:cx7="http://schemas.microsoft.com/office/drawing/2016/5/13/chartex" xmlns:cx8="http://schemas.microsoft.com/office/drawing/2016/5/14/chartex" xmlns:mc="http://schemas.openxmlformats.org/markup-compatibility/2006" xmlns:aink="http://schemas.microsoft.com/office/drawing/2016/ink" xmlns:am3d="http://schemas.microsoft.com/office/drawing/2017/model3d" xmlns:o="urn:schemas-microsoft-com:office:office" xmlns:oel="http://schemas.microsoft.com/office/2019/extlst" xmlns:r="http://schemas.openxmlformats.org/officeDocument/2006/relationships" xmlns:m="http://schemas.openxmlformats.org/officeDocument/2006/math" xmlns:v="urn:schemas-microsoft-com:vml" xmlns:wp14="http://schemas.microsoft.com/office/word/2010/wordprocessingDrawing" xmlns:wp="http://schemas.openxmlformats.org/drawingml/2006/wordprocessingDrawing" xmlns:w10="urn:schemas-microsoft-com:office:word" xmlns:w="http://schemas.openxmlformats.org/wordprocessingml/2006/main" xmlns:w14="http://schemas.microsoft.com/office/word/2010/wordml" xmlns:w15="http://schemas.microsoft.com/office/word/2012/wordml" xmlns:w16cei="http://schemas.microsoft.com/office/word/2026/wordml/cei" xmlns:w16cex="http://schemas.microsoft.com/office/word/2018/wordml/cex" xmlns:w16cid="http://schemas.microsoft.com/office/word/2016/wordml/cid" xmlns:w16="http://schemas.microsoft.com/office/word/2018/wordml" xmlns:w16du="http://schemas.microsoft.com/office/word/2023/wordml/word16du" xmlns:w16sdtdh="http://schemas.microsoft.com/office/word/2020/wordml/sdtdatahash" xmlns:w16sdtfl="http://schemas.microsoft.com/office/word/2024/wordml/sdtformatlock" xmlns:w16se="http://schemas.microsoft.com/office/word/2015/wordml/symex" xmlns:wpg="http://schemas.microsoft.com/office/word/2010/wordprocessingGroup" xmlns:wpi="http://schemas.microsoft.com/office/word/2010/wordprocessingInk" xmlns:wne="http://schemas.microsoft.com/office/word/2006/wordml" xmlns:wps="http://schemas.microsoft.com/office/word/2010/wordprocessingShape" mc:Ignorable="w14 w15 w16se w16cid w16 w16cex w16sdtdh w16sdtfl w16du wp14">
   <w16cid:commentId w16cid:paraId="2769EEDB" w16cid:durableId="15C9830F"/>
-  <w16cid:commentId w16cid:paraId="00000047" w16cid:durableId="00000047"/>
-  <w16cid:commentId w16cid:paraId="4889BF48" w16cid:durableId="7428BFB7"/>
 </w16cid:commentsIds>
 </file>
 
@@ -11163,9 +9927,6 @@
 <w15:people xmlns:wpc="http://schemas.microsoft.com/office/word/2010/wordprocessingCanvas" xmlns:cx="http://schemas.microsoft.com/office/drawing/2014/chartex" xmlns:cx1="http://schemas.microsoft.com/office/drawing/2015/9/8/chartex" xmlns:cx2="http://schemas.microsoft.com/office/drawing/2015/10/21/chartex" xmlns:cx3="http://schemas.microsoft.com/office/drawing/2016/5/9/chartex" xmlns:cx4="http://schemas.microsoft.com/office/drawing/2016/5/10/chartex" xmlns:cx5="http://schemas.microsoft.com/office/drawing/2016/5/11/chartex" xmlns:cx6="http://schemas.microsoft.com/office/drawing/2016/5/12/chartex" xmlns:cx7="http://schemas.microsoft.com/office/drawing/2016/5/13/chartex" xmlns:cx8="http://schemas.microsoft.com/office/drawing/2016/5/14/chartex" xmlns:mc="http://schemas.openxmlformats.org/markup-compatibility/2006" xmlns:aink="http://schemas.microsoft.com/office/drawing/2016/ink" xmlns:am3d="http://schemas.microsoft.com/office/drawing/2017/model3d" xmlns:o="urn:schemas-microsoft-com:office:office" xmlns:oel="http://schemas.microsoft.com/office/2019/extlst" xmlns:r="http://schemas.openxmlformats.org/officeDocument/2006/relationships" xmlns:m="http://schemas.openxmlformats.org/officeDocument/2006/math" xmlns:v="urn:schemas-microsoft-com:vml" xmlns:wp14="http://schemas.microsoft.com/office/word/2010/wordprocessingDrawing" xmlns:wp="http://schemas.openxmlformats.org/drawingml/2006/wordprocessingDrawing" xmlns:w10="urn:schemas-microsoft-com:office:word" xmlns:w="http://schemas.openxmlformats.org/wordprocessingml/2006/main" xmlns:w14="http://schemas.microsoft.com/office/word/2010/wordml" xmlns:w15="http://schemas.microsoft.com/office/word/2012/wordml" xmlns:w16cei="http://schemas.microsoft.com/office/word/2026/wordml/cei" xmlns:w16cex="http://schemas.microsoft.com/office/word/2018/wordml/cex" xmlns:w16cid="http://schemas.microsoft.com/office/word/2016/wordml/cid" xmlns:w16="http://schemas.microsoft.com/office/word/2018/wordml" xmlns:w16du="http://schemas.microsoft.com/office/word/2023/wordml/word16du" xmlns:w16sdtdh="http://schemas.microsoft.com/office/word/2020/wordml/sdtdatahash" xmlns:w16sdtfl="http://schemas.microsoft.com/office/word/2024/wordml/sdtformatlock" xmlns:w16se="http://schemas.microsoft.com/office/word/2015/wordml/symex" xmlns:wpg="http://schemas.microsoft.com/office/word/2010/wordprocessingGroup" xmlns:wpi="http://schemas.microsoft.com/office/word/2010/wordprocessingInk" xmlns:wne="http://schemas.microsoft.com/office/word/2006/wordml" xmlns:wps="http://schemas.microsoft.com/office/word/2010/wordprocessingShape" mc:Ignorable="w14 w15 w16se w16cid w16 w16cex w16sdtdh w16sdtfl w16du wp14">
   <w15:person w15:author="Rossella Falcone">
     <w15:presenceInfo w15:providerId="AD" w15:userId="S::rossella.falcone@einsteinmed.edu::02dd4923-bc26-4ba5-91d5-d648cbbd263f"/>
-  </w15:person>
-  <w15:person w15:author="Siyu Wang">
-    <w15:presenceInfo w15:providerId="Windows Live" w15:userId="3f00a5b4dc936d2d"/>
   </w15:person>
 </w15:people>
 </file>
@@ -11838,16 +10599,6 @@
       <w:szCs w:val="20"/>
     </w:rPr>
   </w:style>
-  <w:style w:type="paragraph" w:styleId="Revision">
-    <w:name w:val="Revision"/>
-    <w:hidden/>
-    <w:uiPriority w:val="99"/>
-    <w:semiHidden/>
-    <w:rsid w:val="00745D1D"/>
-    <w:pPr>
-      <w:spacing w:line="240" w:lineRule="auto"/>
-    </w:pPr>
-  </w:style>
 </w:styles>
 </file>
 

</xml_diff>